<commit_message>
Update Calc 3 2.5 Curvature guide and notes
Co-Authored-By: Claude Sonnet 5 <noreply@anthropic.com>
</commit_message>
<xml_diff>
--- a/Course Materials/Calc 3/Notes/Ch. 2 (Vector-Valued Functions)/2.5 Curvature_Guide.docx
+++ b/Course Materials/Calc 3/Notes/Ch. 2 (Vector-Valued Functions)/2.5 Curvature_Guide.docx
@@ -152,10 +152,10 @@
                   <v:path o:extrusionok="f" gradientshapeok="t" o:connecttype="rect"/>
                   <o:lock v:ext="edit" aspectratio="t"/>
                 </v:shapetype>
-                <v:shape id="_x0000_i1025" type="#_x0000_t75" style="width:25.35pt;height:21.3pt" o:ole="">
+                <v:shape id="_x0000_i1025" type="#_x0000_t75" style="width:25.5pt;height:21pt" o:ole="">
                   <v:imagedata r:id="rId8" o:title=""/>
                 </v:shape>
-                <o:OLEObject Type="Embed" ProgID="Equation.DSMT4" ShapeID="_x0000_i1025" DrawAspect="Content" ObjectID="_1846091661" r:id="rId9"/>
+                <o:OLEObject Type="Embed" ProgID="Equation.DSMT4" ShapeID="_x0000_i1025" DrawAspect="Content" ObjectID="_1851423603" r:id="rId9"/>
               </w:object>
             </w:r>
             <w:r>
@@ -208,10 +208,10 @@
                 <w:szCs w:val="24"/>
               </w:rPr>
               <w:object w:dxaOrig="240" w:dyaOrig="260" w14:anchorId="65505816">
-                <v:shape id="_x0000_i1026" type="#_x0000_t75" style="width:12.15pt;height:12.15pt" o:ole="">
+                <v:shape id="_x0000_i1026" type="#_x0000_t75" style="width:12pt;height:12pt" o:ole="">
                   <v:imagedata r:id="rId10" o:title=""/>
                 </v:shape>
-                <o:OLEObject Type="Embed" ProgID="Equation.DSMT4" ShapeID="_x0000_i1026" DrawAspect="Content" ObjectID="_1846091662" r:id="rId11"/>
+                <o:OLEObject Type="Embed" ProgID="Equation.DSMT4" ShapeID="_x0000_i1026" DrawAspect="Content" ObjectID="_1851423604" r:id="rId11"/>
               </w:object>
             </w:r>
             <w:r>
@@ -230,10 +230,10 @@
                 <w:szCs w:val="24"/>
               </w:rPr>
               <w:object w:dxaOrig="880" w:dyaOrig="400" w14:anchorId="2DE77BC4">
-                <v:shape id="_x0000_i1027" type="#_x0000_t75" style="width:43.6pt;height:21.3pt" o:ole="">
+                <v:shape id="_x0000_i1027" type="#_x0000_t75" style="width:43.5pt;height:21pt" o:ole="">
                   <v:imagedata r:id="rId12" o:title=""/>
                 </v:shape>
-                <o:OLEObject Type="Embed" ProgID="Equation.DSMT4" ShapeID="_x0000_i1027" DrawAspect="Content" ObjectID="_1846091663" r:id="rId13"/>
+                <o:OLEObject Type="Embed" ProgID="Equation.DSMT4" ShapeID="_x0000_i1027" DrawAspect="Content" ObjectID="_1851423605" r:id="rId13"/>
               </w:object>
             </w:r>
             <w:r>
@@ -259,7 +259,25 @@
                 <w:sz w:val="24"/>
                 <w:szCs w:val="24"/>
               </w:rPr>
-              <w:t xml:space="preserve"> if it has a smooth parameterization.  A smooth curve has no sharp corners or cusps.</w:t>
+              <w:t xml:space="preserve"> if it has </w:t>
+            </w:r>
+            <w:proofErr w:type="gramStart"/>
+            <w:r>
+              <w:rPr>
+                <w:rFonts w:ascii="Times New Roman" w:hAnsi="Times New Roman" w:cs="Times New Roman"/>
+                <w:sz w:val="24"/>
+                <w:szCs w:val="24"/>
+              </w:rPr>
+              <w:t>a smooth</w:t>
+            </w:r>
+            <w:proofErr w:type="gramEnd"/>
+            <w:r>
+              <w:rPr>
+                <w:rFonts w:ascii="Times New Roman" w:hAnsi="Times New Roman" w:cs="Times New Roman"/>
+                <w:sz w:val="24"/>
+                <w:szCs w:val="24"/>
+              </w:rPr>
+              <w:t xml:space="preserve"> parameterization.  A smooth curve has no sharp corners or cusps.</w:t>
             </w:r>
           </w:p>
           <w:p>
@@ -291,15 +309,34 @@
           <w:sz w:val="24"/>
           <w:szCs w:val="24"/>
         </w:rPr>
-        <w:t>Remark:</w:t>
-      </w:r>
-      <w:r>
-        <w:rPr>
-          <w:rFonts w:ascii="Times New Roman" w:hAnsi="Times New Roman" w:cs="Times New Roman"/>
-          <w:sz w:val="24"/>
-          <w:szCs w:val="24"/>
-        </w:rPr>
-        <w:t xml:space="preserve">  For a smooth curve given by </w:t>
+        <w:t>Remark</w:t>
+      </w:r>
+      <w:proofErr w:type="gramStart"/>
+      <w:r>
+        <w:rPr>
+          <w:rFonts w:ascii="Times New Roman" w:hAnsi="Times New Roman" w:cs="Times New Roman"/>
+          <w:b/>
+          <w:sz w:val="24"/>
+          <w:szCs w:val="24"/>
+        </w:rPr>
+        <w:t>:</w:t>
+      </w:r>
+      <w:r>
+        <w:rPr>
+          <w:rFonts w:ascii="Times New Roman" w:hAnsi="Times New Roman" w:cs="Times New Roman"/>
+          <w:sz w:val="24"/>
+          <w:szCs w:val="24"/>
+        </w:rPr>
+        <w:t xml:space="preserve">  For</w:t>
+      </w:r>
+      <w:proofErr w:type="gramEnd"/>
+      <w:r>
+        <w:rPr>
+          <w:rFonts w:ascii="Times New Roman" w:hAnsi="Times New Roman" w:cs="Times New Roman"/>
+          <w:sz w:val="24"/>
+          <w:szCs w:val="24"/>
+        </w:rPr>
+        <w:t xml:space="preserve"> a smooth curve given by </w:t>
       </w:r>
       <w:r>
         <w:rPr>
@@ -309,10 +346,10 @@
           <w:szCs w:val="24"/>
         </w:rPr>
         <w:object w:dxaOrig="480" w:dyaOrig="400" w14:anchorId="033E9B87">
-          <v:shape id="_x0000_i1028" type="#_x0000_t75" style="width:25.35pt;height:21.3pt" o:ole="">
+          <v:shape id="_x0000_i1028" type="#_x0000_t75" style="width:25.5pt;height:21pt" o:ole="">
             <v:imagedata r:id="rId8" o:title=""/>
           </v:shape>
-          <o:OLEObject Type="Embed" ProgID="Equation.DSMT4" ShapeID="_x0000_i1028" DrawAspect="Content" ObjectID="_1846091664" r:id="rId14"/>
+          <o:OLEObject Type="Embed" ProgID="Equation.DSMT4" ShapeID="_x0000_i1028" DrawAspect="Content" ObjectID="_1851423606" r:id="rId14"/>
         </w:object>
       </w:r>
       <w:r>
@@ -331,10 +368,10 @@
           <w:szCs w:val="24"/>
         </w:rPr>
         <w:object w:dxaOrig="480" w:dyaOrig="320" w14:anchorId="5B36F21E">
-          <v:shape id="_x0000_i1029" type="#_x0000_t75" style="width:25.35pt;height:16.25pt" o:ole="">
+          <v:shape id="_x0000_i1029" type="#_x0000_t75" style="width:25.5pt;height:16.5pt" o:ole="">
             <v:imagedata r:id="rId15" o:title=""/>
           </v:shape>
-          <o:OLEObject Type="Embed" ProgID="Equation.DSMT4" ShapeID="_x0000_i1029" DrawAspect="Content" ObjectID="_1846091665" r:id="rId16"/>
+          <o:OLEObject Type="Embed" ProgID="Equation.DSMT4" ShapeID="_x0000_i1029" DrawAspect="Content" ObjectID="_1851423607" r:id="rId16"/>
         </w:object>
       </w:r>
       <w:r>
@@ -371,10 +408,10 @@
           <w:szCs w:val="24"/>
         </w:rPr>
         <w:object w:dxaOrig="480" w:dyaOrig="320" w14:anchorId="462E032A">
-          <v:shape id="_x0000_i1030" type="#_x0000_t75" style="width:25.35pt;height:16.25pt" o:ole="">
+          <v:shape id="_x0000_i1030" type="#_x0000_t75" style="width:25.5pt;height:16.5pt" o:ole="">
             <v:imagedata r:id="rId15" o:title=""/>
           </v:shape>
-          <o:OLEObject Type="Embed" ProgID="Equation.DSMT4" ShapeID="_x0000_i1030" DrawAspect="Content" ObjectID="_1846091666" r:id="rId17"/>
+          <o:OLEObject Type="Embed" ProgID="Equation.DSMT4" ShapeID="_x0000_i1030" DrawAspect="Content" ObjectID="_1851423608" r:id="rId17"/>
         </w:object>
       </w:r>
       <w:r>
@@ -393,10 +430,10 @@
           <w:szCs w:val="24"/>
         </w:rPr>
         <w:object w:dxaOrig="480" w:dyaOrig="320" w14:anchorId="322AFA9F">
-          <v:shape id="_x0000_i1031" type="#_x0000_t75" style="width:25.35pt;height:16.25pt" o:ole="">
+          <v:shape id="_x0000_i1031" type="#_x0000_t75" style="width:25.5pt;height:16.5pt" o:ole="">
             <v:imagedata r:id="rId15" o:title=""/>
           </v:shape>
-          <o:OLEObject Type="Embed" ProgID="Equation.DSMT4" ShapeID="_x0000_i1031" DrawAspect="Content" ObjectID="_1846091667" r:id="rId18"/>
+          <o:OLEObject Type="Embed" ProgID="Equation.DSMT4" ShapeID="_x0000_i1031" DrawAspect="Content" ObjectID="_1851423609" r:id="rId18"/>
         </w:object>
       </w:r>
       <w:r>
@@ -443,7 +480,7 @@
           <w:szCs w:val="24"/>
         </w:rPr>
         <w:drawing>
-          <wp:anchor distT="0" distB="0" distL="114300" distR="114300" simplePos="0" relativeHeight="251659264" behindDoc="0" locked="0" layoutInCell="1" allowOverlap="1" wp14:anchorId="54FA92CF" wp14:editId="4589F168">
+          <wp:anchor distT="0" distB="0" distL="114300" distR="114300" simplePos="0" relativeHeight="251659264" behindDoc="0" locked="0" layoutInCell="1" allowOverlap="1" wp14:anchorId="54FA92CF" wp14:editId="418EBE36">
             <wp:simplePos x="0" y="0"/>
             <wp:positionH relativeFrom="margin">
               <wp:align>center</wp:align>
@@ -452,7 +489,7 @@
               <wp:posOffset>78238</wp:posOffset>
             </wp:positionV>
             <wp:extent cx="5114290" cy="755015"/>
-            <wp:effectExtent l="0" t="0" r="0" b="6985"/>
+            <wp:effectExtent l="19050" t="19050" r="10160" b="26035"/>
             <wp:wrapSquare wrapText="bothSides"/>
             <wp:docPr id="3" name="Picture 3" descr="4 pictures of different curves that increasing have more bend/change-of-direction over the same amount of arc length."/>
             <wp:cNvGraphicFramePr>
@@ -489,8 +526,10 @@
                       <a:avLst/>
                     </a:prstGeom>
                     <a:noFill/>
-                    <a:ln w="38100">
-                      <a:noFill/>
+                    <a:ln w="12700">
+                      <a:solidFill>
+                        <a:schemeClr val="tx1"/>
+                      </a:solidFill>
                     </a:ln>
                   </pic:spPr>
                 </pic:pic>
@@ -624,7 +663,17 @@
                 <w:sz w:val="24"/>
                 <w:szCs w:val="24"/>
               </w:rPr>
-              <w:t>Definition:</w:t>
+              <w:t>Definition</w:t>
+            </w:r>
+            <w:proofErr w:type="gramStart"/>
+            <w:r>
+              <w:rPr>
+                <w:rFonts w:ascii="Times New Roman" w:hAnsi="Times New Roman" w:cs="Times New Roman"/>
+                <w:b/>
+                <w:sz w:val="24"/>
+                <w:szCs w:val="24"/>
+              </w:rPr>
+              <w:t>:</w:t>
             </w:r>
             <w:r>
               <w:rPr>
@@ -632,7 +681,16 @@
                 <w:sz w:val="24"/>
                 <w:szCs w:val="24"/>
               </w:rPr>
-              <w:t xml:space="preserve">  The </w:t>
+              <w:t xml:space="preserve">  The</w:t>
+            </w:r>
+            <w:proofErr w:type="gramEnd"/>
+            <w:r>
+              <w:rPr>
+                <w:rFonts w:ascii="Times New Roman" w:hAnsi="Times New Roman" w:cs="Times New Roman"/>
+                <w:sz w:val="24"/>
+                <w:szCs w:val="24"/>
+              </w:rPr>
+              <w:t xml:space="preserve"> </w:t>
             </w:r>
             <w:r>
               <w:rPr>
@@ -659,10 +717,10 @@
                 <w:szCs w:val="24"/>
               </w:rPr>
               <w:object w:dxaOrig="920" w:dyaOrig="680" w14:anchorId="2B568E1E">
-                <v:shape id="_x0000_i1032" type="#_x0000_t75" style="width:46.65pt;height:33.45pt" o:ole="">
+                <v:shape id="_x0000_i1032" type="#_x0000_t75" style="width:46.5pt;height:33.75pt" o:ole="">
                   <v:imagedata r:id="rId20" o:title=""/>
                 </v:shape>
-                <o:OLEObject Type="Embed" ProgID="Equation.DSMT4" ShapeID="_x0000_i1032" DrawAspect="Content" ObjectID="_1846091668" r:id="rId21"/>
+                <o:OLEObject Type="Embed" ProgID="Equation.DSMT4" ShapeID="_x0000_i1032" DrawAspect="Content" ObjectID="_1851423610" r:id="rId21"/>
               </w:object>
             </w:r>
             <w:r>
@@ -687,6 +745,754 @@
         </w:tc>
       </w:tr>
     </w:tbl>
+    <w:p>
+      <w:pPr>
+        <w:pStyle w:val="NoSpacing"/>
+        <w:rPr>
+          <w:rFonts w:ascii="Times New Roman" w:hAnsi="Times New Roman" w:cs="Times New Roman"/>
+          <w:sz w:val="24"/>
+          <w:szCs w:val="24"/>
+        </w:rPr>
+      </w:pPr>
+    </w:p>
+    <w:p>
+      <w:pPr>
+        <w:pStyle w:val="NoSpacing"/>
+        <w:rPr>
+          <w:rFonts w:ascii="Times New Roman" w:hAnsi="Times New Roman" w:cs="Times New Roman"/>
+          <w:i/>
+          <w:iCs/>
+          <w:sz w:val="24"/>
+          <w:szCs w:val="24"/>
+          <w:u w:val="single"/>
+        </w:rPr>
+      </w:pPr>
+      <w:r>
+        <w:rPr>
+          <w:rFonts w:ascii="Times New Roman" w:hAnsi="Times New Roman" w:cs="Times New Roman"/>
+          <w:i/>
+          <w:iCs/>
+          <w:sz w:val="24"/>
+          <w:szCs w:val="24"/>
+          <w:u w:val="single"/>
+        </w:rPr>
+        <w:t>How does the definition work?</w:t>
+      </w:r>
+    </w:p>
+    <w:p>
+      <w:pPr>
+        <w:pStyle w:val="NoSpacing"/>
+        <w:rPr>
+          <w:rFonts w:ascii="Times New Roman" w:hAnsi="Times New Roman" w:cs="Times New Roman"/>
+          <w:sz w:val="24"/>
+          <w:szCs w:val="24"/>
+        </w:rPr>
+      </w:pPr>
+      <w:r>
+        <w:rPr>
+          <w:rFonts w:ascii="Times New Roman" w:hAnsi="Times New Roman" w:cs="Times New Roman"/>
+          <w:noProof/>
+          <w:sz w:val="24"/>
+          <w:szCs w:val="24"/>
+        </w:rPr>
+        <w:drawing>
+          <wp:anchor distT="0" distB="0" distL="114300" distR="114300" simplePos="0" relativeHeight="251661312" behindDoc="1" locked="0" layoutInCell="1" allowOverlap="1" wp14:anchorId="516DA318" wp14:editId="7616A3A3">
+            <wp:simplePos x="0" y="0"/>
+            <wp:positionH relativeFrom="column">
+              <wp:posOffset>4882515</wp:posOffset>
+            </wp:positionH>
+            <wp:positionV relativeFrom="paragraph">
+              <wp:posOffset>6350</wp:posOffset>
+            </wp:positionV>
+            <wp:extent cx="2355215" cy="1574800"/>
+            <wp:effectExtent l="0" t="0" r="6985" b="6350"/>
+            <wp:wrapTight wrapText="bothSides">
+              <wp:wrapPolygon edited="0">
+                <wp:start x="0" y="0"/>
+                <wp:lineTo x="0" y="21426"/>
+                <wp:lineTo x="21489" y="21426"/>
+                <wp:lineTo x="21489" y="0"/>
+                <wp:lineTo x="0" y="0"/>
+              </wp:wrapPolygon>
+            </wp:wrapTight>
+            <wp:docPr id="1458063864" name="Picture 1"/>
+            <wp:cNvGraphicFramePr>
+              <a:graphicFrameLocks xmlns:a="http://schemas.openxmlformats.org/drawingml/2006/main" noChangeAspect="1"/>
+            </wp:cNvGraphicFramePr>
+            <a:graphic xmlns:a="http://schemas.openxmlformats.org/drawingml/2006/main">
+              <a:graphicData uri="http://schemas.openxmlformats.org/drawingml/2006/picture">
+                <pic:pic xmlns:pic="http://schemas.openxmlformats.org/drawingml/2006/picture">
+                  <pic:nvPicPr>
+                    <pic:cNvPr id="1458063864" name=""/>
+                    <pic:cNvPicPr/>
+                  </pic:nvPicPr>
+                  <pic:blipFill>
+                    <a:blip r:embed="rId22" cstate="print">
+                      <a:extLst>
+                        <a:ext uri="{28A0092B-C50C-407E-A947-70E740481C1C}">
+                          <a14:useLocalDpi xmlns:a14="http://schemas.microsoft.com/office/drawing/2010/main" val="0"/>
+                        </a:ext>
+                      </a:extLst>
+                    </a:blip>
+                    <a:stretch>
+                      <a:fillRect/>
+                    </a:stretch>
+                  </pic:blipFill>
+                  <pic:spPr>
+                    <a:xfrm>
+                      <a:off x="0" y="0"/>
+                      <a:ext cx="2355215" cy="1574800"/>
+                    </a:xfrm>
+                    <a:prstGeom prst="rect">
+                      <a:avLst/>
+                    </a:prstGeom>
+                  </pic:spPr>
+                </pic:pic>
+              </a:graphicData>
+            </a:graphic>
+            <wp14:sizeRelH relativeFrom="page">
+              <wp14:pctWidth>0</wp14:pctWidth>
+            </wp14:sizeRelH>
+            <wp14:sizeRelV relativeFrom="page">
+              <wp14:pctHeight>0</wp14:pctHeight>
+            </wp14:sizeRelV>
+          </wp:anchor>
+        </w:drawing>
+      </w:r>
+      <w:r>
+        <w:rPr>
+          <w:rFonts w:ascii="Times New Roman" w:hAnsi="Times New Roman" w:cs="Times New Roman"/>
+          <w:sz w:val="24"/>
+          <w:szCs w:val="24"/>
+        </w:rPr>
+        <w:t>If we can find the arc length parameterization for</w:t>
+      </w:r>
+      <w:r>
+        <w:rPr>
+          <w:rFonts w:ascii="Times New Roman" w:hAnsi="Times New Roman" w:cs="Times New Roman"/>
+          <w:position w:val="-14"/>
+          <w:sz w:val="24"/>
+          <w:szCs w:val="24"/>
+        </w:rPr>
+        <w:object w:dxaOrig="780" w:dyaOrig="400" w14:anchorId="78DC10A6">
+          <v:shape id="_x0000_i1033" type="#_x0000_t75" style="width:39pt;height:20.25pt" o:ole="">
+            <v:imagedata r:id="rId23" o:title=""/>
+          </v:shape>
+          <o:OLEObject Type="Embed" ProgID="Equation.DSMT4" ShapeID="_x0000_i1033" DrawAspect="Content" ObjectID="_1851423611" r:id="rId24"/>
+        </w:object>
+      </w:r>
+      <w:r>
+        <w:rPr>
+          <w:rFonts w:ascii="Times New Roman" w:hAnsi="Times New Roman" w:cs="Times New Roman"/>
+          <w:sz w:val="24"/>
+          <w:szCs w:val="24"/>
+        </w:rPr>
+        <w:t xml:space="preserve">, we can get </w:t>
+      </w:r>
+      <w:r>
+        <w:rPr>
+          <w:rFonts w:ascii="Times New Roman" w:hAnsi="Times New Roman" w:cs="Times New Roman"/>
+          <w:position w:val="-14"/>
+          <w:sz w:val="24"/>
+          <w:szCs w:val="24"/>
+        </w:rPr>
+        <w:object w:dxaOrig="560" w:dyaOrig="400" w14:anchorId="2D77A951">
+          <v:shape id="_x0000_i1034" type="#_x0000_t75" style="width:28.5pt;height:20.25pt" o:ole="">
+            <v:imagedata r:id="rId25" o:title=""/>
+          </v:shape>
+          <o:OLEObject Type="Embed" ProgID="Equation.DSMT4" ShapeID="_x0000_i1034" DrawAspect="Content" ObjectID="_1851423612" r:id="rId26"/>
+        </w:object>
+      </w:r>
+      <w:r>
+        <w:rPr>
+          <w:rFonts w:ascii="Times New Roman" w:hAnsi="Times New Roman" w:cs="Times New Roman"/>
+          <w:sz w:val="24"/>
+          <w:szCs w:val="24"/>
+        </w:rPr>
+        <w:t xml:space="preserve"> and the calculate </w:t>
+      </w:r>
+      <w:r>
+        <w:rPr>
+          <w:rFonts w:ascii="Times New Roman" w:hAnsi="Times New Roman" w:cs="Times New Roman"/>
+          <w:position w:val="-16"/>
+          <w:sz w:val="24"/>
+          <w:szCs w:val="24"/>
+        </w:rPr>
+        <w:object w:dxaOrig="740" w:dyaOrig="440" w14:anchorId="62A74963">
+          <v:shape id="_x0000_i1035" type="#_x0000_t75" style="width:36.75pt;height:21.75pt" o:ole="">
+            <v:imagedata r:id="rId27" o:title=""/>
+          </v:shape>
+          <o:OLEObject Type="Embed" ProgID="Equation.DSMT4" ShapeID="_x0000_i1035" DrawAspect="Content" ObjectID="_1851423613" r:id="rId28"/>
+        </w:object>
+      </w:r>
+      <w:r>
+        <w:rPr>
+          <w:rFonts w:ascii="Times New Roman" w:hAnsi="Times New Roman" w:cs="Times New Roman"/>
+          <w:sz w:val="24"/>
+          <w:szCs w:val="24"/>
+        </w:rPr>
+        <w:t>.</w:t>
+      </w:r>
+    </w:p>
+    <w:p>
+      <w:pPr>
+        <w:pStyle w:val="NoSpacing"/>
+        <w:rPr>
+          <w:rFonts w:ascii="Times New Roman" w:hAnsi="Times New Roman" w:cs="Times New Roman"/>
+          <w:sz w:val="24"/>
+          <w:szCs w:val="24"/>
+        </w:rPr>
+      </w:pPr>
+    </w:p>
+    <w:p>
+      <w:pPr>
+        <w:pStyle w:val="NoSpacing"/>
+        <w:rPr>
+          <w:rFonts w:ascii="Times New Roman" w:hAnsi="Times New Roman" w:cs="Times New Roman"/>
+          <w:sz w:val="24"/>
+          <w:szCs w:val="24"/>
+        </w:rPr>
+      </w:pPr>
+      <w:r>
+        <w:rPr>
+          <w:rFonts w:ascii="Times New Roman" w:hAnsi="Times New Roman" w:cs="Times New Roman"/>
+          <w:sz w:val="24"/>
+          <w:szCs w:val="24"/>
+        </w:rPr>
+        <w:t xml:space="preserve">Suppose that we have the vector function </w:t>
+      </w:r>
+      <w:r>
+        <w:rPr>
+          <w:rFonts w:ascii="Times New Roman" w:hAnsi="Times New Roman" w:cs="Times New Roman"/>
+          <w:position w:val="-16"/>
+          <w:sz w:val="24"/>
+          <w:szCs w:val="24"/>
+        </w:rPr>
+        <w:object w:dxaOrig="2380" w:dyaOrig="440" w14:anchorId="46B74750">
+          <v:shape id="_x0000_i1036" type="#_x0000_t75" style="width:119.25pt;height:21.75pt" o:ole="">
+            <v:imagedata r:id="rId29" o:title=""/>
+          </v:shape>
+          <o:OLEObject Type="Embed" ProgID="Equation.DSMT4" ShapeID="_x0000_i1036" DrawAspect="Content" ObjectID="_1851423614" r:id="rId30"/>
+        </w:object>
+      </w:r>
+      <w:r>
+        <w:rPr>
+          <w:rFonts w:ascii="Times New Roman" w:hAnsi="Times New Roman" w:cs="Times New Roman"/>
+          <w:sz w:val="24"/>
+          <w:szCs w:val="24"/>
+        </w:rPr>
+        <w:t>and what to find the curvature here.</w:t>
+      </w:r>
+    </w:p>
+    <w:p>
+      <w:pPr>
+        <w:pStyle w:val="NoSpacing"/>
+        <w:ind w:left="720"/>
+        <w:rPr>
+          <w:rFonts w:ascii="Times New Roman" w:hAnsi="Times New Roman" w:cs="Times New Roman"/>
+          <w:sz w:val="24"/>
+          <w:szCs w:val="24"/>
+        </w:rPr>
+      </w:pPr>
+    </w:p>
+    <w:p>
+      <w:pPr>
+        <w:pStyle w:val="NoSpacing"/>
+        <w:rPr>
+          <w:rFonts w:ascii="Times New Roman" w:hAnsi="Times New Roman" w:cs="Times New Roman"/>
+          <w:sz w:val="24"/>
+          <w:szCs w:val="24"/>
+        </w:rPr>
+      </w:pPr>
+    </w:p>
+    <w:p>
+      <w:pPr>
+        <w:pStyle w:val="NoSpacing"/>
+        <w:rPr>
+          <w:rFonts w:ascii="Times New Roman" w:hAnsi="Times New Roman" w:cs="Times New Roman"/>
+          <w:sz w:val="24"/>
+          <w:szCs w:val="24"/>
+        </w:rPr>
+      </w:pPr>
+    </w:p>
+    <w:p>
+      <w:pPr>
+        <w:pStyle w:val="NoSpacing"/>
+        <w:rPr>
+          <w:rFonts w:ascii="Times New Roman" w:hAnsi="Times New Roman" w:cs="Times New Roman"/>
+          <w:sz w:val="24"/>
+          <w:szCs w:val="24"/>
+        </w:rPr>
+      </w:pPr>
+    </w:p>
+    <w:p>
+      <w:pPr>
+        <w:pStyle w:val="NoSpacing"/>
+        <w:rPr>
+          <w:rFonts w:ascii="Times New Roman" w:hAnsi="Times New Roman" w:cs="Times New Roman"/>
+          <w:sz w:val="24"/>
+          <w:szCs w:val="24"/>
+        </w:rPr>
+      </w:pPr>
+    </w:p>
+    <w:p>
+      <w:pPr>
+        <w:pStyle w:val="NoSpacing"/>
+        <w:rPr>
+          <w:rFonts w:ascii="Times New Roman" w:hAnsi="Times New Roman" w:cs="Times New Roman"/>
+          <w:sz w:val="24"/>
+          <w:szCs w:val="24"/>
+        </w:rPr>
+      </w:pPr>
+    </w:p>
+    <w:p>
+      <w:pPr>
+        <w:pStyle w:val="NoSpacing"/>
+        <w:rPr>
+          <w:rFonts w:ascii="Times New Roman" w:hAnsi="Times New Roman" w:cs="Times New Roman"/>
+          <w:sz w:val="24"/>
+          <w:szCs w:val="24"/>
+        </w:rPr>
+      </w:pPr>
+    </w:p>
+    <w:p>
+      <w:pPr>
+        <w:pStyle w:val="NoSpacing"/>
+        <w:rPr>
+          <w:rFonts w:ascii="Times New Roman" w:hAnsi="Times New Roman" w:cs="Times New Roman"/>
+          <w:sz w:val="24"/>
+          <w:szCs w:val="24"/>
+        </w:rPr>
+      </w:pPr>
+    </w:p>
+    <w:p>
+      <w:pPr>
+        <w:pStyle w:val="NoSpacing"/>
+        <w:rPr>
+          <w:rFonts w:ascii="Times New Roman" w:hAnsi="Times New Roman" w:cs="Times New Roman"/>
+          <w:sz w:val="24"/>
+          <w:szCs w:val="24"/>
+        </w:rPr>
+      </w:pPr>
+    </w:p>
+    <w:p>
+      <w:pPr>
+        <w:pStyle w:val="NoSpacing"/>
+        <w:rPr>
+          <w:rFonts w:ascii="Times New Roman" w:hAnsi="Times New Roman" w:cs="Times New Roman"/>
+          <w:sz w:val="24"/>
+          <w:szCs w:val="24"/>
+        </w:rPr>
+      </w:pPr>
+    </w:p>
+    <w:p>
+      <w:pPr>
+        <w:pStyle w:val="NoSpacing"/>
+        <w:rPr>
+          <w:rFonts w:ascii="Times New Roman" w:hAnsi="Times New Roman" w:cs="Times New Roman"/>
+          <w:sz w:val="24"/>
+          <w:szCs w:val="24"/>
+        </w:rPr>
+      </w:pPr>
+    </w:p>
+    <w:p>
+      <w:pPr>
+        <w:pStyle w:val="NoSpacing"/>
+        <w:rPr>
+          <w:rFonts w:ascii="Times New Roman" w:hAnsi="Times New Roman" w:cs="Times New Roman"/>
+          <w:sz w:val="24"/>
+          <w:szCs w:val="24"/>
+        </w:rPr>
+      </w:pPr>
+    </w:p>
+    <w:p>
+      <w:pPr>
+        <w:pStyle w:val="NoSpacing"/>
+        <w:rPr>
+          <w:rFonts w:ascii="Times New Roman" w:hAnsi="Times New Roman" w:cs="Times New Roman"/>
+          <w:sz w:val="24"/>
+          <w:szCs w:val="24"/>
+        </w:rPr>
+      </w:pPr>
+      <w:r>
+        <w:rPr>
+          <w:rFonts w:ascii="Times New Roman" w:hAnsi="Times New Roman" w:cs="Times New Roman"/>
+          <w:sz w:val="24"/>
+          <w:szCs w:val="24"/>
+        </w:rPr>
+        <w:t>Therefore, we have an arc length parameterization of</w:t>
+      </w:r>
+    </w:p>
+    <w:p>
+      <w:pPr>
+        <w:pStyle w:val="NoSpacing"/>
+        <w:rPr>
+          <w:rFonts w:ascii="Times New Roman" w:hAnsi="Times New Roman" w:cs="Times New Roman"/>
+          <w:sz w:val="24"/>
+          <w:szCs w:val="24"/>
+        </w:rPr>
+      </w:pPr>
+      <w:r>
+        <w:rPr>
+          <w:rFonts w:ascii="Times New Roman" w:hAnsi="Times New Roman" w:cs="Times New Roman"/>
+          <w:sz w:val="24"/>
+          <w:szCs w:val="24"/>
+        </w:rPr>
+        <w:lastRenderedPageBreak/>
+        <w:t xml:space="preserve">Now we attempt to calculate </w:t>
+      </w:r>
+      <w:r>
+        <w:rPr>
+          <w:rFonts w:ascii="Times New Roman" w:hAnsi="Times New Roman" w:cs="Times New Roman"/>
+          <w:position w:val="-34"/>
+          <w:sz w:val="24"/>
+          <w:szCs w:val="24"/>
+        </w:rPr>
+        <w:object w:dxaOrig="1460" w:dyaOrig="760" w14:anchorId="01B38BDD">
+          <v:shape id="_x0000_i1037" type="#_x0000_t75" style="width:73.5pt;height:38.25pt" o:ole="">
+            <v:imagedata r:id="rId31" o:title=""/>
+          </v:shape>
+          <o:OLEObject Type="Embed" ProgID="Equation.DSMT4" ShapeID="_x0000_i1037" DrawAspect="Content" ObjectID="_1851423615" r:id="rId32"/>
+        </w:object>
+      </w:r>
+      <w:r>
+        <w:rPr>
+          <w:rFonts w:ascii="Times New Roman" w:hAnsi="Times New Roman" w:cs="Times New Roman"/>
+          <w:sz w:val="24"/>
+          <w:szCs w:val="24"/>
+        </w:rPr>
+        <w:t>.</w:t>
+      </w:r>
+    </w:p>
+    <w:p>
+      <w:pPr>
+        <w:pStyle w:val="NoSpacing"/>
+        <w:rPr>
+          <w:rFonts w:ascii="Times New Roman" w:hAnsi="Times New Roman" w:cs="Times New Roman"/>
+          <w:sz w:val="24"/>
+          <w:szCs w:val="24"/>
+        </w:rPr>
+      </w:pPr>
+      <w:r>
+        <w:rPr>
+          <w:rFonts w:ascii="Times New Roman" w:hAnsi="Times New Roman" w:cs="Times New Roman"/>
+          <w:sz w:val="24"/>
+          <w:szCs w:val="24"/>
+        </w:rPr>
+        <w:tab/>
+      </w:r>
+    </w:p>
+    <w:p>
+      <w:pPr>
+        <w:pStyle w:val="NoSpacing"/>
+        <w:rPr>
+          <w:rFonts w:ascii="Times New Roman" w:hAnsi="Times New Roman" w:cs="Times New Roman"/>
+          <w:sz w:val="24"/>
+          <w:szCs w:val="24"/>
+        </w:rPr>
+      </w:pPr>
+    </w:p>
+    <w:p>
+      <w:pPr>
+        <w:pStyle w:val="NoSpacing"/>
+        <w:rPr>
+          <w:rFonts w:ascii="Times New Roman" w:hAnsi="Times New Roman" w:cs="Times New Roman"/>
+          <w:sz w:val="24"/>
+          <w:szCs w:val="24"/>
+        </w:rPr>
+      </w:pPr>
+    </w:p>
+    <w:p>
+      <w:pPr>
+        <w:pStyle w:val="NoSpacing"/>
+        <w:rPr>
+          <w:rFonts w:ascii="Times New Roman" w:hAnsi="Times New Roman" w:cs="Times New Roman"/>
+          <w:sz w:val="24"/>
+          <w:szCs w:val="24"/>
+        </w:rPr>
+      </w:pPr>
+    </w:p>
+    <w:p>
+      <w:pPr>
+        <w:pStyle w:val="NoSpacing"/>
+        <w:rPr>
+          <w:rFonts w:ascii="Times New Roman" w:hAnsi="Times New Roman" w:cs="Times New Roman"/>
+          <w:sz w:val="24"/>
+          <w:szCs w:val="24"/>
+        </w:rPr>
+      </w:pPr>
+    </w:p>
+    <w:p>
+      <w:pPr>
+        <w:pStyle w:val="NoSpacing"/>
+        <w:rPr>
+          <w:rFonts w:ascii="Times New Roman" w:hAnsi="Times New Roman" w:cs="Times New Roman"/>
+          <w:sz w:val="24"/>
+          <w:szCs w:val="24"/>
+        </w:rPr>
+      </w:pPr>
+    </w:p>
+    <w:p>
+      <w:pPr>
+        <w:pStyle w:val="NoSpacing"/>
+        <w:rPr>
+          <w:rFonts w:ascii="Times New Roman" w:hAnsi="Times New Roman" w:cs="Times New Roman"/>
+          <w:sz w:val="24"/>
+          <w:szCs w:val="24"/>
+        </w:rPr>
+      </w:pPr>
+    </w:p>
+    <w:p>
+      <w:pPr>
+        <w:pStyle w:val="NoSpacing"/>
+        <w:rPr>
+          <w:rFonts w:ascii="Times New Roman" w:hAnsi="Times New Roman" w:cs="Times New Roman"/>
+          <w:sz w:val="24"/>
+          <w:szCs w:val="24"/>
+        </w:rPr>
+      </w:pPr>
+    </w:p>
+    <w:p>
+      <w:pPr>
+        <w:pStyle w:val="NoSpacing"/>
+        <w:rPr>
+          <w:rFonts w:ascii="Times New Roman" w:hAnsi="Times New Roman" w:cs="Times New Roman"/>
+          <w:sz w:val="24"/>
+          <w:szCs w:val="24"/>
+        </w:rPr>
+      </w:pPr>
+    </w:p>
+    <w:p>
+      <w:pPr>
+        <w:pStyle w:val="NoSpacing"/>
+        <w:rPr>
+          <w:rFonts w:ascii="Times New Roman" w:hAnsi="Times New Roman" w:cs="Times New Roman"/>
+          <w:sz w:val="24"/>
+          <w:szCs w:val="24"/>
+        </w:rPr>
+      </w:pPr>
+    </w:p>
+    <w:p>
+      <w:pPr>
+        <w:pStyle w:val="NoSpacing"/>
+        <w:rPr>
+          <w:rFonts w:ascii="Times New Roman" w:hAnsi="Times New Roman" w:cs="Times New Roman"/>
+          <w:sz w:val="24"/>
+          <w:szCs w:val="24"/>
+        </w:rPr>
+      </w:pPr>
+    </w:p>
+    <w:p>
+      <w:pPr>
+        <w:pStyle w:val="NoSpacing"/>
+        <w:rPr>
+          <w:rFonts w:ascii="Times New Roman" w:hAnsi="Times New Roman" w:cs="Times New Roman"/>
+          <w:sz w:val="24"/>
+          <w:szCs w:val="24"/>
+        </w:rPr>
+      </w:pPr>
+    </w:p>
+    <w:p>
+      <w:pPr>
+        <w:pStyle w:val="NoSpacing"/>
+        <w:rPr>
+          <w:rFonts w:ascii="Times New Roman" w:hAnsi="Times New Roman" w:cs="Times New Roman"/>
+          <w:sz w:val="24"/>
+          <w:szCs w:val="24"/>
+        </w:rPr>
+      </w:pPr>
+    </w:p>
+    <w:p>
+      <w:pPr>
+        <w:pStyle w:val="NoSpacing"/>
+        <w:rPr>
+          <w:rFonts w:ascii="Times New Roman" w:hAnsi="Times New Roman" w:cs="Times New Roman"/>
+          <w:sz w:val="24"/>
+          <w:szCs w:val="24"/>
+        </w:rPr>
+      </w:pPr>
+      <w:r>
+        <w:rPr>
+          <w:rFonts w:ascii="Times New Roman" w:hAnsi="Times New Roman" w:cs="Times New Roman"/>
+          <w:sz w:val="24"/>
+          <w:szCs w:val="24"/>
+        </w:rPr>
+        <w:t xml:space="preserve">Therefore, </w:t>
+      </w:r>
+    </w:p>
+    <w:p>
+      <w:pPr>
+        <w:pStyle w:val="NoSpacing"/>
+        <w:ind w:firstLine="720"/>
+        <w:rPr>
+          <w:rFonts w:ascii="Times New Roman" w:hAnsi="Times New Roman" w:cs="Times New Roman"/>
+          <w:sz w:val="24"/>
+          <w:szCs w:val="24"/>
+        </w:rPr>
+      </w:pPr>
+      <w:r>
+        <w:rPr>
+          <w:rFonts w:ascii="Times New Roman" w:hAnsi="Times New Roman" w:cs="Times New Roman"/>
+          <w:position w:val="-24"/>
+          <w:sz w:val="24"/>
+          <w:szCs w:val="24"/>
+        </w:rPr>
+        <w:object w:dxaOrig="580" w:dyaOrig="620" w14:anchorId="0CCB6D76">
+          <v:shape id="_x0000_i1038" type="#_x0000_t75" style="width:29.25pt;height:30.75pt" o:ole="">
+            <v:imagedata r:id="rId33" o:title=""/>
+          </v:shape>
+          <o:OLEObject Type="Embed" ProgID="Equation.DSMT4" ShapeID="_x0000_i1038" DrawAspect="Content" ObjectID="_1851423616" r:id="rId34"/>
+        </w:object>
+      </w:r>
+      <w:r>
+        <w:rPr>
+          <w:rFonts w:ascii="Times New Roman" w:hAnsi="Times New Roman" w:cs="Times New Roman"/>
+          <w:sz w:val="24"/>
+          <w:szCs w:val="24"/>
+        </w:rPr>
+        <w:t xml:space="preserve"> </w:t>
+      </w:r>
+    </w:p>
+    <w:p>
+      <w:pPr>
+        <w:pStyle w:val="NoSpacing"/>
+        <w:rPr>
+          <w:rFonts w:ascii="Times New Roman" w:hAnsi="Times New Roman" w:cs="Times New Roman"/>
+          <w:sz w:val="24"/>
+          <w:szCs w:val="24"/>
+        </w:rPr>
+      </w:pPr>
+    </w:p>
+    <w:p>
+      <w:pPr>
+        <w:pStyle w:val="NoSpacing"/>
+        <w:rPr>
+          <w:rFonts w:ascii="Times New Roman" w:hAnsi="Times New Roman" w:cs="Times New Roman"/>
+          <w:sz w:val="24"/>
+          <w:szCs w:val="24"/>
+        </w:rPr>
+      </w:pPr>
+    </w:p>
+    <w:p>
+      <w:pPr>
+        <w:pStyle w:val="NoSpacing"/>
+        <w:rPr>
+          <w:rFonts w:ascii="Times New Roman" w:hAnsi="Times New Roman" w:cs="Times New Roman"/>
+          <w:sz w:val="24"/>
+          <w:szCs w:val="24"/>
+        </w:rPr>
+      </w:pPr>
+    </w:p>
+    <w:p>
+      <w:pPr>
+        <w:pStyle w:val="NoSpacing"/>
+        <w:rPr>
+          <w:rFonts w:ascii="Times New Roman" w:hAnsi="Times New Roman" w:cs="Times New Roman"/>
+          <w:sz w:val="24"/>
+          <w:szCs w:val="24"/>
+        </w:rPr>
+      </w:pPr>
+    </w:p>
+    <w:p>
+      <w:pPr>
+        <w:pStyle w:val="NoSpacing"/>
+        <w:rPr>
+          <w:rFonts w:ascii="Times New Roman" w:hAnsi="Times New Roman" w:cs="Times New Roman"/>
+          <w:sz w:val="24"/>
+          <w:szCs w:val="24"/>
+        </w:rPr>
+      </w:pPr>
+    </w:p>
+    <w:p>
+      <w:pPr>
+        <w:pStyle w:val="NoSpacing"/>
+        <w:rPr>
+          <w:rFonts w:ascii="Times New Roman" w:hAnsi="Times New Roman" w:cs="Times New Roman"/>
+          <w:sz w:val="24"/>
+          <w:szCs w:val="24"/>
+        </w:rPr>
+      </w:pPr>
+    </w:p>
+    <w:p>
+      <w:pPr>
+        <w:pStyle w:val="NoSpacing"/>
+        <w:rPr>
+          <w:rFonts w:ascii="Times New Roman" w:hAnsi="Times New Roman" w:cs="Times New Roman"/>
+          <w:sz w:val="24"/>
+          <w:szCs w:val="24"/>
+        </w:rPr>
+      </w:pPr>
+    </w:p>
+    <w:p>
+      <w:pPr>
+        <w:pStyle w:val="NoSpacing"/>
+        <w:rPr>
+          <w:rFonts w:ascii="Times New Roman" w:hAnsi="Times New Roman" w:cs="Times New Roman"/>
+          <w:sz w:val="24"/>
+          <w:szCs w:val="24"/>
+        </w:rPr>
+      </w:pPr>
+    </w:p>
+    <w:p>
+      <w:pPr>
+        <w:pStyle w:val="NoSpacing"/>
+        <w:rPr>
+          <w:rFonts w:ascii="Times New Roman" w:hAnsi="Times New Roman" w:cs="Times New Roman"/>
+          <w:sz w:val="24"/>
+          <w:szCs w:val="24"/>
+        </w:rPr>
+      </w:pPr>
+      <w:proofErr w:type="gramStart"/>
+      <w:r>
+        <w:rPr>
+          <w:rFonts w:ascii="Times New Roman" w:hAnsi="Times New Roman" w:cs="Times New Roman"/>
+          <w:sz w:val="24"/>
+          <w:szCs w:val="24"/>
+        </w:rPr>
+        <w:t>So</w:t>
+      </w:r>
+      <w:proofErr w:type="gramEnd"/>
+      <w:r>
+        <w:rPr>
+          <w:rFonts w:ascii="Times New Roman" w:hAnsi="Times New Roman" w:cs="Times New Roman"/>
+          <w:sz w:val="24"/>
+          <w:szCs w:val="24"/>
+        </w:rPr>
+        <w:t xml:space="preserve"> we say that the curvature for </w:t>
+      </w:r>
+      <w:r>
+        <w:rPr>
+          <w:rFonts w:ascii="Times New Roman" w:hAnsi="Times New Roman" w:cs="Times New Roman"/>
+          <w:position w:val="-14"/>
+          <w:sz w:val="24"/>
+          <w:szCs w:val="24"/>
+        </w:rPr>
+        <w:object w:dxaOrig="480" w:dyaOrig="400" w14:anchorId="05659635">
+          <v:shape id="_x0000_i1039" type="#_x0000_t75" style="width:24pt;height:20.25pt" o:ole="">
+            <v:imagedata r:id="rId35" o:title=""/>
+          </v:shape>
+          <o:OLEObject Type="Embed" ProgID="Equation.DSMT4" ShapeID="_x0000_i1039" DrawAspect="Content" ObjectID="_1851423617" r:id="rId36"/>
+        </w:object>
+      </w:r>
+      <w:r>
+        <w:rPr>
+          <w:rFonts w:ascii="Times New Roman" w:hAnsi="Times New Roman" w:cs="Times New Roman"/>
+          <w:sz w:val="24"/>
+          <w:szCs w:val="24"/>
+        </w:rPr>
+        <w:t>is</w:t>
+      </w:r>
+    </w:p>
+    <w:p>
+      <w:pPr>
+        <w:pStyle w:val="NoSpacing"/>
+        <w:rPr>
+          <w:rFonts w:ascii="Times New Roman" w:hAnsi="Times New Roman" w:cs="Times New Roman"/>
+          <w:sz w:val="24"/>
+          <w:szCs w:val="24"/>
+        </w:rPr>
+      </w:pPr>
+    </w:p>
     <w:p>
       <w:pPr>
         <w:pStyle w:val="NoSpacing"/>
@@ -763,10 +1569,10 @@
                 <w:szCs w:val="24"/>
               </w:rPr>
               <w:object w:dxaOrig="480" w:dyaOrig="400" w14:anchorId="5B54AAF3">
-                <v:shape id="_x0000_i1033" type="#_x0000_t75" style="width:25.35pt;height:21.3pt" o:ole="">
+                <v:shape id="_x0000_i1040" type="#_x0000_t75" style="width:25.5pt;height:21pt" o:ole="">
                   <v:imagedata r:id="rId8" o:title=""/>
                 </v:shape>
-                <o:OLEObject Type="Embed" ProgID="Equation.DSMT4" ShapeID="_x0000_i1033" DrawAspect="Content" ObjectID="_1846091669" r:id="rId22"/>
+                <o:OLEObject Type="Embed" ProgID="Equation.DSMT4" ShapeID="_x0000_i1040" DrawAspect="Content" ObjectID="_1851423618" r:id="rId37"/>
               </w:object>
             </w:r>
             <w:r>
@@ -815,10 +1621,10 @@
                 <w:szCs w:val="24"/>
               </w:rPr>
               <w:object w:dxaOrig="1340" w:dyaOrig="740" w14:anchorId="37136D3B">
-                <v:shape id="_x0000_i1034" type="#_x0000_t75" style="width:65.95pt;height:37.5pt" o:ole="">
-                  <v:imagedata r:id="rId23" o:title=""/>
+                <v:shape id="_x0000_i1041" type="#_x0000_t75" style="width:66pt;height:37.5pt" o:ole="">
+                  <v:imagedata r:id="rId38" o:title=""/>
                 </v:shape>
-                <o:OLEObject Type="Embed" ProgID="Equation.DSMT4" ShapeID="_x0000_i1034" DrawAspect="Content" ObjectID="_1846091670" r:id="rId24"/>
+                <o:OLEObject Type="Embed" ProgID="Equation.DSMT4" ShapeID="_x0000_i1041" DrawAspect="Content" ObjectID="_1851423619" r:id="rId39"/>
               </w:object>
             </w:r>
             <w:r>
@@ -870,10 +1676,10 @@
                 <w:szCs w:val="24"/>
               </w:rPr>
               <w:object w:dxaOrig="2040" w:dyaOrig="840" w14:anchorId="4AF242BE">
-                <v:shape id="_x0000_i1035" type="#_x0000_t75" style="width:101.4pt;height:41.6pt" o:ole="">
-                  <v:imagedata r:id="rId25" o:title=""/>
+                <v:shape id="_x0000_i1042" type="#_x0000_t75" style="width:101.25pt;height:41.25pt" o:ole="">
+                  <v:imagedata r:id="rId40" o:title=""/>
                 </v:shape>
-                <o:OLEObject Type="Embed" ProgID="Equation.DSMT4" ShapeID="_x0000_i1035" DrawAspect="Content" ObjectID="_1846091671" r:id="rId26"/>
+                <o:OLEObject Type="Embed" ProgID="Equation.DSMT4" ShapeID="_x0000_i1042" DrawAspect="Content" ObjectID="_1851423620" r:id="rId41"/>
               </w:object>
             </w:r>
           </w:p>
@@ -907,7 +1713,7 @@
           <w:sz w:val="24"/>
           <w:szCs w:val="24"/>
         </w:rPr>
-        <w:t xml:space="preserve">Proof:  </w:t>
+        <w:t>Proof:</w:t>
       </w:r>
       <w:r>
         <w:rPr>
@@ -916,18 +1722,86 @@
           <w:sz w:val="24"/>
           <w:szCs w:val="24"/>
         </w:rPr>
-        <w:t>We will prove (2).  A proof of (1) is available in Blackboard.</w:t>
-      </w:r>
-    </w:p>
-    <w:p>
-      <w:pPr>
-        <w:pStyle w:val="NoSpacing"/>
-        <w:rPr>
-          <w:rFonts w:ascii="Times New Roman" w:hAnsi="Times New Roman" w:cs="Times New Roman"/>
-          <w:sz w:val="24"/>
-          <w:szCs w:val="24"/>
-        </w:rPr>
-      </w:pPr>
+        <w:t xml:space="preserve">  Proofs of (1) and (2) are </w:t>
+      </w:r>
+      <w:r>
+        <w:rPr>
+          <w:rFonts w:ascii="Times New Roman" w:hAnsi="Times New Roman" w:cs="Times New Roman"/>
+          <w:i/>
+          <w:sz w:val="24"/>
+          <w:szCs w:val="24"/>
+        </w:rPr>
+        <w:t>available in Blackboard.</w:t>
+      </w:r>
+    </w:p>
+    <w:p>
+      <w:pPr>
+        <w:pStyle w:val="NoSpacing"/>
+        <w:rPr>
+          <w:rFonts w:ascii="Times New Roman" w:hAnsi="Times New Roman" w:cs="Times New Roman"/>
+          <w:i/>
+          <w:sz w:val="24"/>
+          <w:szCs w:val="24"/>
+        </w:rPr>
+      </w:pPr>
+    </w:p>
+    <w:p>
+      <w:pPr>
+        <w:pStyle w:val="NoSpacing"/>
+        <w:rPr>
+          <w:rFonts w:ascii="Times New Roman" w:hAnsi="Times New Roman" w:cs="Times New Roman"/>
+          <w:i/>
+          <w:sz w:val="24"/>
+          <w:szCs w:val="24"/>
+        </w:rPr>
+      </w:pPr>
+      <w:r>
+        <w:rPr>
+          <w:rFonts w:ascii="Times New Roman" w:hAnsi="Times New Roman" w:cs="Times New Roman"/>
+          <w:i/>
+          <w:sz w:val="24"/>
+          <w:szCs w:val="24"/>
+        </w:rPr>
+        <w:t>Note</w:t>
+      </w:r>
+      <w:proofErr w:type="gramStart"/>
+      <w:r>
+        <w:rPr>
+          <w:rFonts w:ascii="Times New Roman" w:hAnsi="Times New Roman" w:cs="Times New Roman"/>
+          <w:i/>
+          <w:sz w:val="24"/>
+          <w:szCs w:val="24"/>
+        </w:rPr>
+        <w:t>:  These</w:t>
+      </w:r>
+      <w:proofErr w:type="gramEnd"/>
+      <w:r>
+        <w:rPr>
+          <w:rFonts w:ascii="Times New Roman" w:hAnsi="Times New Roman" w:cs="Times New Roman"/>
+          <w:i/>
+          <w:sz w:val="24"/>
+          <w:szCs w:val="24"/>
+        </w:rPr>
+        <w:t xml:space="preserve"> </w:t>
+      </w:r>
+      <w:r>
+        <w:rPr>
+          <w:rFonts w:ascii="Times New Roman" w:hAnsi="Times New Roman" w:cs="Times New Roman"/>
+          <w:i/>
+          <w:sz w:val="24"/>
+          <w:szCs w:val="24"/>
+        </w:rPr>
+        <w:t xml:space="preserve">formulas provide us with a much easier way to compute the curvature </w:t>
+      </w:r>
+      <w:r>
+        <w:rPr>
+          <w:rFonts w:ascii="Times New Roman" w:hAnsi="Times New Roman" w:cs="Times New Roman"/>
+          <w:i/>
+          <w:sz w:val="24"/>
+          <w:szCs w:val="24"/>
+        </w:rPr>
+        <w:t>compared with computing directly from the definition.</w:t>
+      </w:r>
     </w:p>
     <w:p>
       <w:pPr>
@@ -943,236 +1817,6 @@
     <w:p>
       <w:pPr>
         <w:pStyle w:val="NoSpacing"/>
-        <w:jc w:val="right"/>
-        <w:rPr>
-          <w:rFonts w:ascii="Times New Roman" w:hAnsi="Times New Roman" w:cs="Times New Roman"/>
-          <w:sz w:val="24"/>
-          <w:szCs w:val="24"/>
-        </w:rPr>
-      </w:pPr>
-    </w:p>
-    <w:p>
-      <w:pPr>
-        <w:pStyle w:val="NoSpacing"/>
-        <w:jc w:val="right"/>
-        <w:rPr>
-          <w:rFonts w:ascii="Times New Roman" w:hAnsi="Times New Roman" w:cs="Times New Roman"/>
-          <w:sz w:val="24"/>
-          <w:szCs w:val="24"/>
-        </w:rPr>
-      </w:pPr>
-    </w:p>
-    <w:p>
-      <w:pPr>
-        <w:pStyle w:val="NoSpacing"/>
-        <w:jc w:val="right"/>
-        <w:rPr>
-          <w:rFonts w:ascii="Times New Roman" w:hAnsi="Times New Roman" w:cs="Times New Roman"/>
-          <w:sz w:val="24"/>
-          <w:szCs w:val="24"/>
-        </w:rPr>
-      </w:pPr>
-    </w:p>
-    <w:p>
-      <w:pPr>
-        <w:pStyle w:val="NoSpacing"/>
-        <w:jc w:val="right"/>
-        <w:rPr>
-          <w:rFonts w:ascii="Times New Roman" w:hAnsi="Times New Roman" w:cs="Times New Roman"/>
-          <w:sz w:val="24"/>
-          <w:szCs w:val="24"/>
-        </w:rPr>
-      </w:pPr>
-    </w:p>
-    <w:p>
-      <w:pPr>
-        <w:pStyle w:val="NoSpacing"/>
-        <w:jc w:val="right"/>
-        <w:rPr>
-          <w:rFonts w:ascii="Times New Roman" w:hAnsi="Times New Roman" w:cs="Times New Roman"/>
-          <w:sz w:val="24"/>
-          <w:szCs w:val="24"/>
-        </w:rPr>
-      </w:pPr>
-    </w:p>
-    <w:p>
-      <w:pPr>
-        <w:pStyle w:val="NoSpacing"/>
-        <w:jc w:val="right"/>
-        <w:rPr>
-          <w:rFonts w:ascii="Times New Roman" w:hAnsi="Times New Roman" w:cs="Times New Roman"/>
-          <w:sz w:val="24"/>
-          <w:szCs w:val="24"/>
-        </w:rPr>
-      </w:pPr>
-    </w:p>
-    <w:p>
-      <w:pPr>
-        <w:pStyle w:val="NoSpacing"/>
-        <w:jc w:val="right"/>
-        <w:rPr>
-          <w:rFonts w:ascii="Times New Roman" w:hAnsi="Times New Roman" w:cs="Times New Roman"/>
-          <w:sz w:val="24"/>
-          <w:szCs w:val="24"/>
-        </w:rPr>
-      </w:pPr>
-    </w:p>
-    <w:p>
-      <w:pPr>
-        <w:pStyle w:val="NoSpacing"/>
-        <w:jc w:val="right"/>
-        <w:rPr>
-          <w:rFonts w:ascii="Times New Roman" w:hAnsi="Times New Roman" w:cs="Times New Roman"/>
-          <w:sz w:val="24"/>
-          <w:szCs w:val="24"/>
-        </w:rPr>
-      </w:pPr>
-    </w:p>
-    <w:p>
-      <w:pPr>
-        <w:pStyle w:val="NoSpacing"/>
-        <w:jc w:val="right"/>
-        <w:rPr>
-          <w:rFonts w:ascii="Times New Roman" w:hAnsi="Times New Roman" w:cs="Times New Roman"/>
-          <w:sz w:val="24"/>
-          <w:szCs w:val="24"/>
-        </w:rPr>
-      </w:pPr>
-    </w:p>
-    <w:p>
-      <w:pPr>
-        <w:pStyle w:val="NoSpacing"/>
-        <w:jc w:val="right"/>
-        <w:rPr>
-          <w:rFonts w:ascii="Times New Roman" w:hAnsi="Times New Roman" w:cs="Times New Roman"/>
-          <w:sz w:val="24"/>
-          <w:szCs w:val="24"/>
-        </w:rPr>
-      </w:pPr>
-    </w:p>
-    <w:p>
-      <w:pPr>
-        <w:pStyle w:val="NoSpacing"/>
-        <w:jc w:val="right"/>
-        <w:rPr>
-          <w:rFonts w:ascii="Times New Roman" w:hAnsi="Times New Roman" w:cs="Times New Roman"/>
-          <w:sz w:val="24"/>
-          <w:szCs w:val="24"/>
-        </w:rPr>
-      </w:pPr>
-    </w:p>
-    <w:p>
-      <w:pPr>
-        <w:pStyle w:val="NoSpacing"/>
-        <w:jc w:val="right"/>
-        <w:rPr>
-          <w:rFonts w:ascii="Times New Roman" w:hAnsi="Times New Roman" w:cs="Times New Roman"/>
-          <w:sz w:val="24"/>
-          <w:szCs w:val="24"/>
-        </w:rPr>
-      </w:pPr>
-    </w:p>
-    <w:p>
-      <w:pPr>
-        <w:pStyle w:val="NoSpacing"/>
-        <w:jc w:val="right"/>
-        <w:rPr>
-          <w:rFonts w:ascii="Times New Roman" w:hAnsi="Times New Roman" w:cs="Times New Roman"/>
-          <w:sz w:val="24"/>
-          <w:szCs w:val="24"/>
-        </w:rPr>
-      </w:pPr>
-    </w:p>
-    <w:p>
-      <w:pPr>
-        <w:pStyle w:val="NoSpacing"/>
-        <w:jc w:val="right"/>
-        <w:rPr>
-          <w:rFonts w:ascii="Times New Roman" w:hAnsi="Times New Roman" w:cs="Times New Roman"/>
-          <w:sz w:val="24"/>
-          <w:szCs w:val="24"/>
-        </w:rPr>
-      </w:pPr>
-    </w:p>
-    <w:p>
-      <w:pPr>
-        <w:pStyle w:val="NoSpacing"/>
-        <w:jc w:val="right"/>
-        <w:rPr>
-          <w:rFonts w:ascii="Times New Roman" w:hAnsi="Times New Roman" w:cs="Times New Roman"/>
-          <w:sz w:val="24"/>
-          <w:szCs w:val="24"/>
-        </w:rPr>
-      </w:pPr>
-    </w:p>
-    <w:p>
-      <w:pPr>
-        <w:pStyle w:val="NoSpacing"/>
-        <w:jc w:val="right"/>
-        <w:rPr>
-          <w:rFonts w:ascii="Times New Roman" w:hAnsi="Times New Roman" w:cs="Times New Roman"/>
-          <w:sz w:val="24"/>
-          <w:szCs w:val="24"/>
-        </w:rPr>
-      </w:pPr>
-    </w:p>
-    <w:p>
-      <w:pPr>
-        <w:pStyle w:val="NoSpacing"/>
-        <w:jc w:val="right"/>
-        <w:rPr>
-          <w:rFonts w:ascii="Times New Roman" w:hAnsi="Times New Roman" w:cs="Times New Roman"/>
-          <w:sz w:val="24"/>
-          <w:szCs w:val="24"/>
-        </w:rPr>
-      </w:pPr>
-    </w:p>
-    <w:p>
-      <w:pPr>
-        <w:pStyle w:val="NoSpacing"/>
-        <w:jc w:val="right"/>
-        <w:rPr>
-          <w:rFonts w:ascii="Times New Roman" w:hAnsi="Times New Roman" w:cs="Times New Roman"/>
-          <w:sz w:val="24"/>
-          <w:szCs w:val="24"/>
-        </w:rPr>
-      </w:pPr>
-    </w:p>
-    <w:p>
-      <w:pPr>
-        <w:pStyle w:val="NoSpacing"/>
-        <w:jc w:val="right"/>
-        <w:rPr>
-          <w:rFonts w:ascii="Times New Roman" w:hAnsi="Times New Roman" w:cs="Times New Roman"/>
-          <w:sz w:val="24"/>
-          <w:szCs w:val="24"/>
-        </w:rPr>
-      </w:pPr>
-    </w:p>
-    <w:p>
-      <w:pPr>
-        <w:pStyle w:val="NoSpacing"/>
-        <w:jc w:val="right"/>
-        <w:rPr>
-          <w:rFonts w:ascii="Times New Roman" w:hAnsi="Times New Roman" w:cs="Times New Roman"/>
-          <w:sz w:val="24"/>
-          <w:szCs w:val="24"/>
-        </w:rPr>
-      </w:pPr>
-    </w:p>
-    <w:p>
-      <w:pPr>
-        <w:pStyle w:val="NoSpacing"/>
-        <w:rPr>
-          <w:rFonts w:ascii="Times New Roman" w:hAnsi="Times New Roman" w:cs="Times New Roman"/>
-          <w:sz w:val="24"/>
-          <w:szCs w:val="24"/>
-        </w:rPr>
-      </w:pPr>
-    </w:p>
-    <w:p>
-      <w:pPr>
-        <w:pStyle w:val="NoSpacing"/>
         <w:rPr>
           <w:rFonts w:ascii="Times New Roman" w:hAnsi="Times New Roman" w:cs="Times New Roman"/>
           <w:i/>
@@ -1180,245 +1824,34 @@
           <w:szCs w:val="24"/>
         </w:rPr>
       </w:pPr>
-    </w:p>
-    <w:p>
-      <w:pPr>
-        <w:pStyle w:val="NoSpacing"/>
+      <w:r>
         <w:rPr>
           <w:rFonts w:ascii="Times New Roman" w:hAnsi="Times New Roman" w:cs="Times New Roman"/>
           <w:i/>
           <w:sz w:val="24"/>
           <w:szCs w:val="24"/>
         </w:rPr>
-      </w:pPr>
-    </w:p>
-    <w:p>
-      <w:pPr>
-        <w:pStyle w:val="NoSpacing"/>
+        <w:t>Note</w:t>
+      </w:r>
+      <w:proofErr w:type="gramStart"/>
+      <w:r>
         <w:rPr>
           <w:rFonts w:ascii="Times New Roman" w:hAnsi="Times New Roman" w:cs="Times New Roman"/>
           <w:i/>
           <w:sz w:val="24"/>
           <w:szCs w:val="24"/>
         </w:rPr>
-      </w:pPr>
-    </w:p>
-    <w:p>
-      <w:pPr>
-        <w:pStyle w:val="NoSpacing"/>
+        <w:t>:  Part</w:t>
+      </w:r>
+      <w:proofErr w:type="gramEnd"/>
+      <w:r>
         <w:rPr>
           <w:rFonts w:ascii="Times New Roman" w:hAnsi="Times New Roman" w:cs="Times New Roman"/>
           <w:i/>
           <w:sz w:val="24"/>
           <w:szCs w:val="24"/>
         </w:rPr>
-      </w:pPr>
-    </w:p>
-    <w:p>
-      <w:pPr>
-        <w:pStyle w:val="NoSpacing"/>
-        <w:rPr>
-          <w:rFonts w:ascii="Times New Roman" w:hAnsi="Times New Roman" w:cs="Times New Roman"/>
-          <w:i/>
-          <w:sz w:val="24"/>
-          <w:szCs w:val="24"/>
-        </w:rPr>
-      </w:pPr>
-    </w:p>
-    <w:p>
-      <w:pPr>
-        <w:pStyle w:val="NoSpacing"/>
-        <w:rPr>
-          <w:rFonts w:ascii="Times New Roman" w:hAnsi="Times New Roman" w:cs="Times New Roman"/>
-          <w:i/>
-          <w:sz w:val="24"/>
-          <w:szCs w:val="24"/>
-        </w:rPr>
-      </w:pPr>
-    </w:p>
-    <w:p>
-      <w:pPr>
-        <w:pStyle w:val="NoSpacing"/>
-        <w:rPr>
-          <w:rFonts w:ascii="Times New Roman" w:hAnsi="Times New Roman" w:cs="Times New Roman"/>
-          <w:i/>
-          <w:sz w:val="24"/>
-          <w:szCs w:val="24"/>
-        </w:rPr>
-      </w:pPr>
-    </w:p>
-    <w:p>
-      <w:pPr>
-        <w:pStyle w:val="NoSpacing"/>
-        <w:rPr>
-          <w:rFonts w:ascii="Times New Roman" w:hAnsi="Times New Roman" w:cs="Times New Roman"/>
-          <w:i/>
-          <w:sz w:val="24"/>
-          <w:szCs w:val="24"/>
-        </w:rPr>
-      </w:pPr>
-    </w:p>
-    <w:p>
-      <w:pPr>
-        <w:pStyle w:val="NoSpacing"/>
-        <w:rPr>
-          <w:rFonts w:ascii="Times New Roman" w:hAnsi="Times New Roman" w:cs="Times New Roman"/>
-          <w:i/>
-          <w:sz w:val="24"/>
-          <w:szCs w:val="24"/>
-        </w:rPr>
-      </w:pPr>
-    </w:p>
-    <w:p>
-      <w:pPr>
-        <w:pStyle w:val="NoSpacing"/>
-        <w:rPr>
-          <w:rFonts w:ascii="Times New Roman" w:hAnsi="Times New Roman" w:cs="Times New Roman"/>
-          <w:i/>
-          <w:sz w:val="24"/>
-          <w:szCs w:val="24"/>
-        </w:rPr>
-      </w:pPr>
-    </w:p>
-    <w:p>
-      <w:pPr>
-        <w:pStyle w:val="NoSpacing"/>
-        <w:rPr>
-          <w:rFonts w:ascii="Times New Roman" w:hAnsi="Times New Roman" w:cs="Times New Roman"/>
-          <w:i/>
-          <w:sz w:val="24"/>
-          <w:szCs w:val="24"/>
-        </w:rPr>
-      </w:pPr>
-    </w:p>
-    <w:p>
-      <w:pPr>
-        <w:pStyle w:val="NoSpacing"/>
-        <w:rPr>
-          <w:rFonts w:ascii="Times New Roman" w:hAnsi="Times New Roman" w:cs="Times New Roman"/>
-          <w:i/>
-          <w:sz w:val="24"/>
-          <w:szCs w:val="24"/>
-        </w:rPr>
-      </w:pPr>
-    </w:p>
-    <w:p>
-      <w:pPr>
-        <w:pStyle w:val="NoSpacing"/>
-        <w:rPr>
-          <w:rFonts w:ascii="Times New Roman" w:hAnsi="Times New Roman" w:cs="Times New Roman"/>
-          <w:i/>
-          <w:sz w:val="24"/>
-          <w:szCs w:val="24"/>
-        </w:rPr>
-      </w:pPr>
-    </w:p>
-    <w:p>
-      <w:pPr>
-        <w:pStyle w:val="NoSpacing"/>
-        <w:rPr>
-          <w:rFonts w:ascii="Times New Roman" w:hAnsi="Times New Roman" w:cs="Times New Roman"/>
-          <w:i/>
-          <w:sz w:val="24"/>
-          <w:szCs w:val="24"/>
-        </w:rPr>
-      </w:pPr>
-    </w:p>
-    <w:p>
-      <w:pPr>
-        <w:pStyle w:val="NoSpacing"/>
-        <w:rPr>
-          <w:rFonts w:ascii="Times New Roman" w:hAnsi="Times New Roman" w:cs="Times New Roman"/>
-          <w:i/>
-          <w:sz w:val="24"/>
-          <w:szCs w:val="24"/>
-        </w:rPr>
-      </w:pPr>
-    </w:p>
-    <w:p>
-      <w:pPr>
-        <w:pStyle w:val="NoSpacing"/>
-        <w:rPr>
-          <w:rFonts w:ascii="Times New Roman" w:hAnsi="Times New Roman" w:cs="Times New Roman"/>
-          <w:i/>
-          <w:sz w:val="24"/>
-          <w:szCs w:val="24"/>
-        </w:rPr>
-      </w:pPr>
-    </w:p>
-    <w:p>
-      <w:pPr>
-        <w:pStyle w:val="NoSpacing"/>
-        <w:rPr>
-          <w:rFonts w:ascii="Times New Roman" w:hAnsi="Times New Roman" w:cs="Times New Roman"/>
-          <w:i/>
-          <w:sz w:val="24"/>
-          <w:szCs w:val="24"/>
-        </w:rPr>
-      </w:pPr>
-    </w:p>
-    <w:p>
-      <w:pPr>
-        <w:pStyle w:val="NoSpacing"/>
-        <w:rPr>
-          <w:rFonts w:ascii="Times New Roman" w:hAnsi="Times New Roman" w:cs="Times New Roman"/>
-          <w:i/>
-          <w:sz w:val="24"/>
-          <w:szCs w:val="24"/>
-        </w:rPr>
-      </w:pPr>
-    </w:p>
-    <w:p>
-      <w:pPr>
-        <w:pStyle w:val="NoSpacing"/>
-        <w:rPr>
-          <w:rFonts w:ascii="Times New Roman" w:hAnsi="Times New Roman" w:cs="Times New Roman"/>
-          <w:i/>
-          <w:sz w:val="24"/>
-          <w:szCs w:val="24"/>
-        </w:rPr>
-      </w:pPr>
-    </w:p>
-    <w:p>
-      <w:pPr>
-        <w:pStyle w:val="NoSpacing"/>
-        <w:rPr>
-          <w:rFonts w:ascii="Times New Roman" w:hAnsi="Times New Roman" w:cs="Times New Roman"/>
-          <w:i/>
-          <w:sz w:val="24"/>
-          <w:szCs w:val="24"/>
-        </w:rPr>
-      </w:pPr>
-    </w:p>
-    <w:p>
-      <w:pPr>
-        <w:pStyle w:val="NoSpacing"/>
-        <w:rPr>
-          <w:rFonts w:ascii="Times New Roman" w:hAnsi="Times New Roman" w:cs="Times New Roman"/>
-          <w:i/>
-          <w:sz w:val="24"/>
-          <w:szCs w:val="24"/>
-        </w:rPr>
-      </w:pPr>
-    </w:p>
-    <w:p>
-      <w:pPr>
-        <w:pStyle w:val="NoSpacing"/>
-        <w:rPr>
-          <w:rFonts w:ascii="Times New Roman" w:hAnsi="Times New Roman" w:cs="Times New Roman"/>
-          <w:i/>
-          <w:sz w:val="24"/>
-          <w:szCs w:val="24"/>
-        </w:rPr>
-      </w:pPr>
-      <w:r>
-        <w:rPr>
-          <w:rFonts w:ascii="Times New Roman" w:hAnsi="Times New Roman" w:cs="Times New Roman"/>
-          <w:i/>
-          <w:sz w:val="24"/>
-          <w:szCs w:val="24"/>
-        </w:rPr>
-        <w:t xml:space="preserve">Note:  Part (b) of this theorem will tend to be more useful since it only requires that we know the vector-valued </w:t>
+        <w:t xml:space="preserve"> (b) of this theorem will tend to be more useful since it only requires that we know the vector-valued </w:t>
       </w:r>
       <w:r>
         <w:rPr>
@@ -1447,10 +1880,10 @@
           <w:szCs w:val="24"/>
         </w:rPr>
         <w:object w:dxaOrig="480" w:dyaOrig="400" w14:anchorId="17B01FEC">
-          <v:shape id="_x0000_i1036" type="#_x0000_t75" style="width:24.35pt;height:19.25pt" o:ole="">
-            <v:imagedata r:id="rId27" o:title=""/>
+          <v:shape id="_x0000_i1043" type="#_x0000_t75" style="width:24pt;height:18.75pt" o:ole="">
+            <v:imagedata r:id="rId42" o:title=""/>
           </v:shape>
-          <o:OLEObject Type="Embed" ProgID="Equation.DSMT4" ShapeID="_x0000_i1036" DrawAspect="Content" ObjectID="_1846091672" r:id="rId28"/>
+          <o:OLEObject Type="Embed" ProgID="Equation.DSMT4" ShapeID="_x0000_i1043" DrawAspect="Content" ObjectID="_1851423621" r:id="rId43"/>
         </w:object>
       </w:r>
       <w:r>
@@ -1480,10 +1913,10 @@
           <w:szCs w:val="24"/>
         </w:rPr>
         <w:object w:dxaOrig="520" w:dyaOrig="400" w14:anchorId="5D9F122E">
-          <v:shape id="_x0000_i1037" type="#_x0000_t75" style="width:27.4pt;height:19.25pt" o:ole="">
-            <v:imagedata r:id="rId29" o:title=""/>
+          <v:shape id="_x0000_i1044" type="#_x0000_t75" style="width:27.75pt;height:18.75pt" o:ole="">
+            <v:imagedata r:id="rId44" o:title=""/>
           </v:shape>
-          <o:OLEObject Type="Embed" ProgID="Equation.DSMT4" ShapeID="_x0000_i1037" DrawAspect="Content" ObjectID="_1846091673" r:id="rId30"/>
+          <o:OLEObject Type="Embed" ProgID="Equation.DSMT4" ShapeID="_x0000_i1044" DrawAspect="Content" ObjectID="_1851423622" r:id="rId45"/>
         </w:object>
       </w:r>
       <w:r>
@@ -1525,24 +1958,570 @@
           <w:szCs w:val="24"/>
         </w:rPr>
       </w:pPr>
+    </w:p>
+    <w:p>
+      <w:pPr>
+        <w:pStyle w:val="NoSpacing"/>
+        <w:rPr>
+          <w:rFonts w:ascii="Times New Roman" w:hAnsi="Times New Roman" w:cs="Times New Roman"/>
+          <w:sz w:val="24"/>
+          <w:szCs w:val="24"/>
+        </w:rPr>
+      </w:pPr>
       <w:r>
         <w:rPr>
           <w:rFonts w:ascii="Times New Roman" w:hAnsi="Times New Roman" w:cs="Times New Roman"/>
           <w:b/>
+          <w:bCs/>
           <w:sz w:val="24"/>
           <w:szCs w:val="24"/>
           <w:u w:val="single"/>
         </w:rPr>
-        <w:t>Example 1</w:t>
-      </w:r>
+        <w:lastRenderedPageBreak/>
+        <w:t>Example 1:</w:t>
+      </w:r>
+      <w:r>
+        <w:rPr>
+          <w:rFonts w:ascii="Times New Roman" w:hAnsi="Times New Roman" w:cs="Times New Roman"/>
+          <w:sz w:val="24"/>
+          <w:szCs w:val="24"/>
+        </w:rPr>
+        <w:t xml:space="preserve">  Use each of the formulas from the theorem above to calculate the curvature of </w:t>
+      </w:r>
+      <w:r>
+        <w:rPr>
+          <w:rFonts w:ascii="Times New Roman" w:hAnsi="Times New Roman" w:cs="Times New Roman"/>
+          <w:position w:val="-16"/>
+          <w:sz w:val="24"/>
+          <w:szCs w:val="24"/>
+        </w:rPr>
+        <w:object w:dxaOrig="2380" w:dyaOrig="440" w14:anchorId="55535905">
+          <v:shape id="_x0000_i1045" type="#_x0000_t75" style="width:119.25pt;height:21.75pt" o:ole="">
+            <v:imagedata r:id="rId46" o:title=""/>
+          </v:shape>
+          <o:OLEObject Type="Embed" ProgID="Equation.DSMT4" ShapeID="_x0000_i1045" DrawAspect="Content" ObjectID="_1851423623" r:id="rId47"/>
+        </w:object>
+      </w:r>
+      <w:r>
+        <w:rPr>
+          <w:rFonts w:ascii="Times New Roman" w:hAnsi="Times New Roman" w:cs="Times New Roman"/>
+          <w:sz w:val="24"/>
+          <w:szCs w:val="24"/>
+        </w:rPr>
+        <w:t>.</w:t>
+      </w:r>
+    </w:p>
+    <w:p>
+      <w:pPr>
+        <w:pStyle w:val="NoSpacing"/>
+        <w:rPr>
+          <w:rFonts w:ascii="Times New Roman" w:hAnsi="Times New Roman" w:cs="Times New Roman"/>
+          <w:sz w:val="24"/>
+          <w:szCs w:val="24"/>
+        </w:rPr>
+      </w:pPr>
+    </w:p>
+    <w:p>
+      <w:pPr>
+        <w:pStyle w:val="NoSpacing"/>
+        <w:rPr>
+          <w:rFonts w:ascii="Times New Roman" w:hAnsi="Times New Roman" w:cs="Times New Roman"/>
+          <w:sz w:val="24"/>
+          <w:szCs w:val="24"/>
+        </w:rPr>
+      </w:pPr>
+    </w:p>
+    <w:p>
+      <w:pPr>
+        <w:pStyle w:val="NoSpacing"/>
+        <w:rPr>
+          <w:rFonts w:ascii="Times New Roman" w:hAnsi="Times New Roman" w:cs="Times New Roman"/>
+          <w:sz w:val="24"/>
+          <w:szCs w:val="24"/>
+        </w:rPr>
+      </w:pPr>
+    </w:p>
+    <w:p>
+      <w:pPr>
+        <w:pStyle w:val="NoSpacing"/>
+        <w:rPr>
+          <w:rFonts w:ascii="Times New Roman" w:hAnsi="Times New Roman" w:cs="Times New Roman"/>
+          <w:sz w:val="24"/>
+          <w:szCs w:val="24"/>
+        </w:rPr>
+      </w:pPr>
+    </w:p>
+    <w:p>
+      <w:pPr>
+        <w:pStyle w:val="NoSpacing"/>
+        <w:rPr>
+          <w:rFonts w:ascii="Times New Roman" w:hAnsi="Times New Roman" w:cs="Times New Roman"/>
+          <w:sz w:val="24"/>
+          <w:szCs w:val="24"/>
+        </w:rPr>
+      </w:pPr>
+    </w:p>
+    <w:p>
+      <w:pPr>
+        <w:pStyle w:val="NoSpacing"/>
+        <w:rPr>
+          <w:rFonts w:ascii="Times New Roman" w:hAnsi="Times New Roman" w:cs="Times New Roman"/>
+          <w:sz w:val="24"/>
+          <w:szCs w:val="24"/>
+        </w:rPr>
+      </w:pPr>
+    </w:p>
+    <w:p>
+      <w:pPr>
+        <w:pStyle w:val="NoSpacing"/>
+        <w:rPr>
+          <w:rFonts w:ascii="Times New Roman" w:hAnsi="Times New Roman" w:cs="Times New Roman"/>
+          <w:sz w:val="24"/>
+          <w:szCs w:val="24"/>
+        </w:rPr>
+      </w:pPr>
+    </w:p>
+    <w:p>
+      <w:pPr>
+        <w:pStyle w:val="NoSpacing"/>
+        <w:rPr>
+          <w:rFonts w:ascii="Times New Roman" w:hAnsi="Times New Roman" w:cs="Times New Roman"/>
+          <w:sz w:val="24"/>
+          <w:szCs w:val="24"/>
+        </w:rPr>
+      </w:pPr>
+    </w:p>
+    <w:p>
+      <w:pPr>
+        <w:pStyle w:val="NoSpacing"/>
+        <w:rPr>
+          <w:rFonts w:ascii="Times New Roman" w:hAnsi="Times New Roman" w:cs="Times New Roman"/>
+          <w:sz w:val="24"/>
+          <w:szCs w:val="24"/>
+        </w:rPr>
+      </w:pPr>
+    </w:p>
+    <w:p>
+      <w:pPr>
+        <w:pStyle w:val="NoSpacing"/>
+        <w:rPr>
+          <w:rFonts w:ascii="Times New Roman" w:hAnsi="Times New Roman" w:cs="Times New Roman"/>
+          <w:sz w:val="24"/>
+          <w:szCs w:val="24"/>
+        </w:rPr>
+      </w:pPr>
+    </w:p>
+    <w:p>
+      <w:pPr>
+        <w:pStyle w:val="NoSpacing"/>
+        <w:rPr>
+          <w:rFonts w:ascii="Times New Roman" w:hAnsi="Times New Roman" w:cs="Times New Roman"/>
+          <w:sz w:val="24"/>
+          <w:szCs w:val="24"/>
+        </w:rPr>
+      </w:pPr>
+    </w:p>
+    <w:p>
+      <w:pPr>
+        <w:pStyle w:val="NoSpacing"/>
+        <w:rPr>
+          <w:rFonts w:ascii="Times New Roman" w:hAnsi="Times New Roman" w:cs="Times New Roman"/>
+          <w:sz w:val="24"/>
+          <w:szCs w:val="24"/>
+        </w:rPr>
+      </w:pPr>
+    </w:p>
+    <w:p>
+      <w:pPr>
+        <w:pStyle w:val="NoSpacing"/>
+        <w:rPr>
+          <w:rFonts w:ascii="Times New Roman" w:hAnsi="Times New Roman" w:cs="Times New Roman"/>
+          <w:sz w:val="24"/>
+          <w:szCs w:val="24"/>
+        </w:rPr>
+      </w:pPr>
+    </w:p>
+    <w:p>
+      <w:pPr>
+        <w:pStyle w:val="NoSpacing"/>
+        <w:rPr>
+          <w:rFonts w:ascii="Times New Roman" w:hAnsi="Times New Roman" w:cs="Times New Roman"/>
+          <w:sz w:val="24"/>
+          <w:szCs w:val="24"/>
+        </w:rPr>
+      </w:pPr>
+    </w:p>
+    <w:p>
+      <w:pPr>
+        <w:pStyle w:val="NoSpacing"/>
+        <w:rPr>
+          <w:rFonts w:ascii="Times New Roman" w:hAnsi="Times New Roman" w:cs="Times New Roman"/>
+          <w:sz w:val="24"/>
+          <w:szCs w:val="24"/>
+        </w:rPr>
+      </w:pPr>
+    </w:p>
+    <w:p>
+      <w:pPr>
+        <w:pStyle w:val="NoSpacing"/>
+        <w:rPr>
+          <w:rFonts w:ascii="Times New Roman" w:hAnsi="Times New Roman" w:cs="Times New Roman"/>
+          <w:sz w:val="24"/>
+          <w:szCs w:val="24"/>
+        </w:rPr>
+      </w:pPr>
+    </w:p>
+    <w:p>
+      <w:pPr>
+        <w:pStyle w:val="NoSpacing"/>
+        <w:rPr>
+          <w:rFonts w:ascii="Times New Roman" w:hAnsi="Times New Roman" w:cs="Times New Roman"/>
+          <w:sz w:val="24"/>
+          <w:szCs w:val="24"/>
+        </w:rPr>
+      </w:pPr>
+    </w:p>
+    <w:p>
+      <w:pPr>
+        <w:pStyle w:val="NoSpacing"/>
+        <w:rPr>
+          <w:rFonts w:ascii="Times New Roman" w:hAnsi="Times New Roman" w:cs="Times New Roman"/>
+          <w:sz w:val="24"/>
+          <w:szCs w:val="24"/>
+        </w:rPr>
+      </w:pPr>
+    </w:p>
+    <w:p>
+      <w:pPr>
+        <w:pStyle w:val="NoSpacing"/>
+        <w:rPr>
+          <w:rFonts w:ascii="Times New Roman" w:hAnsi="Times New Roman" w:cs="Times New Roman"/>
+          <w:sz w:val="24"/>
+          <w:szCs w:val="24"/>
+        </w:rPr>
+      </w:pPr>
+    </w:p>
+    <w:p>
+      <w:pPr>
+        <w:pStyle w:val="NoSpacing"/>
+        <w:rPr>
+          <w:rFonts w:ascii="Times New Roman" w:hAnsi="Times New Roman" w:cs="Times New Roman"/>
+          <w:sz w:val="24"/>
+          <w:szCs w:val="24"/>
+        </w:rPr>
+      </w:pPr>
+    </w:p>
+    <w:p>
+      <w:pPr>
+        <w:pStyle w:val="NoSpacing"/>
+        <w:rPr>
+          <w:rFonts w:ascii="Times New Roman" w:hAnsi="Times New Roman" w:cs="Times New Roman"/>
+          <w:sz w:val="24"/>
+          <w:szCs w:val="24"/>
+        </w:rPr>
+      </w:pPr>
+    </w:p>
+    <w:p>
+      <w:pPr>
+        <w:pStyle w:val="NoSpacing"/>
+        <w:rPr>
+          <w:rFonts w:ascii="Times New Roman" w:hAnsi="Times New Roman" w:cs="Times New Roman"/>
+          <w:sz w:val="24"/>
+          <w:szCs w:val="24"/>
+        </w:rPr>
+      </w:pPr>
+    </w:p>
+    <w:p>
+      <w:pPr>
+        <w:pStyle w:val="NoSpacing"/>
+        <w:rPr>
+          <w:rFonts w:ascii="Times New Roman" w:hAnsi="Times New Roman" w:cs="Times New Roman"/>
+          <w:sz w:val="24"/>
+          <w:szCs w:val="24"/>
+        </w:rPr>
+      </w:pPr>
+    </w:p>
+    <w:p>
+      <w:pPr>
+        <w:pStyle w:val="NoSpacing"/>
+        <w:rPr>
+          <w:rFonts w:ascii="Times New Roman" w:hAnsi="Times New Roman" w:cs="Times New Roman"/>
+          <w:sz w:val="24"/>
+          <w:szCs w:val="24"/>
+        </w:rPr>
+      </w:pPr>
+    </w:p>
+    <w:p>
+      <w:pPr>
+        <w:pStyle w:val="NoSpacing"/>
+        <w:rPr>
+          <w:rFonts w:ascii="Times New Roman" w:hAnsi="Times New Roman" w:cs="Times New Roman"/>
+          <w:sz w:val="24"/>
+          <w:szCs w:val="24"/>
+        </w:rPr>
+      </w:pPr>
+    </w:p>
+    <w:p>
+      <w:pPr>
+        <w:pStyle w:val="NoSpacing"/>
+        <w:rPr>
+          <w:rFonts w:ascii="Times New Roman" w:hAnsi="Times New Roman" w:cs="Times New Roman"/>
+          <w:sz w:val="24"/>
+          <w:szCs w:val="24"/>
+        </w:rPr>
+      </w:pPr>
+    </w:p>
+    <w:p>
+      <w:pPr>
+        <w:pStyle w:val="NoSpacing"/>
+        <w:rPr>
+          <w:rFonts w:ascii="Times New Roman" w:hAnsi="Times New Roman" w:cs="Times New Roman"/>
+          <w:sz w:val="24"/>
+          <w:szCs w:val="24"/>
+        </w:rPr>
+      </w:pPr>
+    </w:p>
+    <w:p>
+      <w:pPr>
+        <w:pStyle w:val="NoSpacing"/>
+        <w:rPr>
+          <w:rFonts w:ascii="Times New Roman" w:hAnsi="Times New Roman" w:cs="Times New Roman"/>
+          <w:sz w:val="24"/>
+          <w:szCs w:val="24"/>
+        </w:rPr>
+      </w:pPr>
+    </w:p>
+    <w:p>
+      <w:pPr>
+        <w:pStyle w:val="NoSpacing"/>
+        <w:rPr>
+          <w:rFonts w:ascii="Times New Roman" w:hAnsi="Times New Roman" w:cs="Times New Roman"/>
+          <w:sz w:val="24"/>
+          <w:szCs w:val="24"/>
+        </w:rPr>
+      </w:pPr>
+    </w:p>
+    <w:p>
+      <w:pPr>
+        <w:pStyle w:val="NoSpacing"/>
+        <w:rPr>
+          <w:rFonts w:ascii="Times New Roman" w:hAnsi="Times New Roman" w:cs="Times New Roman"/>
+          <w:sz w:val="24"/>
+          <w:szCs w:val="24"/>
+        </w:rPr>
+      </w:pPr>
+    </w:p>
+    <w:p>
+      <w:pPr>
+        <w:pStyle w:val="NoSpacing"/>
+        <w:rPr>
+          <w:rFonts w:ascii="Times New Roman" w:hAnsi="Times New Roman" w:cs="Times New Roman"/>
+          <w:sz w:val="24"/>
+          <w:szCs w:val="24"/>
+        </w:rPr>
+      </w:pPr>
+    </w:p>
+    <w:p>
+      <w:pPr>
+        <w:pStyle w:val="NoSpacing"/>
+        <w:rPr>
+          <w:rFonts w:ascii="Times New Roman" w:hAnsi="Times New Roman" w:cs="Times New Roman"/>
+          <w:sz w:val="24"/>
+          <w:szCs w:val="24"/>
+        </w:rPr>
+      </w:pPr>
+    </w:p>
+    <w:p>
+      <w:pPr>
+        <w:pStyle w:val="NoSpacing"/>
+        <w:rPr>
+          <w:rFonts w:ascii="Times New Roman" w:hAnsi="Times New Roman" w:cs="Times New Roman"/>
+          <w:sz w:val="24"/>
+          <w:szCs w:val="24"/>
+        </w:rPr>
+      </w:pPr>
+    </w:p>
+    <w:p>
+      <w:pPr>
+        <w:pStyle w:val="NoSpacing"/>
+        <w:rPr>
+          <w:rFonts w:ascii="Times New Roman" w:hAnsi="Times New Roman" w:cs="Times New Roman"/>
+          <w:sz w:val="24"/>
+          <w:szCs w:val="24"/>
+        </w:rPr>
+      </w:pPr>
+    </w:p>
+    <w:p>
+      <w:pPr>
+        <w:pStyle w:val="NoSpacing"/>
+        <w:rPr>
+          <w:rFonts w:ascii="Times New Roman" w:hAnsi="Times New Roman" w:cs="Times New Roman"/>
+          <w:sz w:val="24"/>
+          <w:szCs w:val="24"/>
+        </w:rPr>
+      </w:pPr>
+    </w:p>
+    <w:p>
+      <w:pPr>
+        <w:pStyle w:val="NoSpacing"/>
+        <w:rPr>
+          <w:rFonts w:ascii="Times New Roman" w:hAnsi="Times New Roman" w:cs="Times New Roman"/>
+          <w:sz w:val="24"/>
+          <w:szCs w:val="24"/>
+        </w:rPr>
+      </w:pPr>
+    </w:p>
+    <w:p>
+      <w:pPr>
+        <w:pStyle w:val="NoSpacing"/>
+        <w:rPr>
+          <w:rFonts w:ascii="Times New Roman" w:hAnsi="Times New Roman" w:cs="Times New Roman"/>
+          <w:sz w:val="24"/>
+          <w:szCs w:val="24"/>
+        </w:rPr>
+      </w:pPr>
+    </w:p>
+    <w:p>
+      <w:pPr>
+        <w:pStyle w:val="NoSpacing"/>
+        <w:rPr>
+          <w:rFonts w:ascii="Times New Roman" w:hAnsi="Times New Roman" w:cs="Times New Roman"/>
+          <w:sz w:val="24"/>
+          <w:szCs w:val="24"/>
+        </w:rPr>
+      </w:pPr>
+    </w:p>
+    <w:p>
+      <w:pPr>
+        <w:pStyle w:val="NoSpacing"/>
+        <w:rPr>
+          <w:rFonts w:ascii="Times New Roman" w:hAnsi="Times New Roman" w:cs="Times New Roman"/>
+          <w:sz w:val="24"/>
+          <w:szCs w:val="24"/>
+        </w:rPr>
+      </w:pPr>
+    </w:p>
+    <w:p>
+      <w:pPr>
+        <w:pStyle w:val="NoSpacing"/>
+        <w:rPr>
+          <w:rFonts w:ascii="Times New Roman" w:hAnsi="Times New Roman" w:cs="Times New Roman"/>
+          <w:sz w:val="24"/>
+          <w:szCs w:val="24"/>
+        </w:rPr>
+      </w:pPr>
+    </w:p>
+    <w:p>
+      <w:pPr>
+        <w:pStyle w:val="NoSpacing"/>
+        <w:rPr>
+          <w:rFonts w:ascii="Times New Roman" w:hAnsi="Times New Roman" w:cs="Times New Roman"/>
+          <w:sz w:val="24"/>
+          <w:szCs w:val="24"/>
+        </w:rPr>
+      </w:pPr>
+    </w:p>
+    <w:p>
+      <w:pPr>
+        <w:pStyle w:val="NoSpacing"/>
+        <w:rPr>
+          <w:rFonts w:ascii="Times New Roman" w:hAnsi="Times New Roman" w:cs="Times New Roman"/>
+          <w:sz w:val="24"/>
+          <w:szCs w:val="24"/>
+        </w:rPr>
+      </w:pPr>
+    </w:p>
+    <w:p>
+      <w:pPr>
+        <w:pStyle w:val="NoSpacing"/>
+        <w:rPr>
+          <w:rFonts w:ascii="Times New Roman" w:hAnsi="Times New Roman" w:cs="Times New Roman"/>
+          <w:sz w:val="24"/>
+          <w:szCs w:val="24"/>
+        </w:rPr>
+      </w:pPr>
+    </w:p>
+    <w:p>
+      <w:pPr>
+        <w:pStyle w:val="NoSpacing"/>
+        <w:rPr>
+          <w:rFonts w:ascii="Times New Roman" w:hAnsi="Times New Roman" w:cs="Times New Roman"/>
+          <w:sz w:val="24"/>
+          <w:szCs w:val="24"/>
+        </w:rPr>
+      </w:pPr>
+    </w:p>
+    <w:p>
+      <w:pPr>
+        <w:pStyle w:val="NoSpacing"/>
+        <w:rPr>
+          <w:rFonts w:ascii="Times New Roman" w:hAnsi="Times New Roman" w:cs="Times New Roman"/>
+          <w:sz w:val="24"/>
+          <w:szCs w:val="24"/>
+        </w:rPr>
+      </w:pPr>
+    </w:p>
+    <w:p>
+      <w:pPr>
+        <w:pStyle w:val="NoSpacing"/>
+        <w:rPr>
+          <w:rFonts w:ascii="Times New Roman" w:hAnsi="Times New Roman" w:cs="Times New Roman"/>
+          <w:sz w:val="24"/>
+          <w:szCs w:val="24"/>
+        </w:rPr>
+      </w:pPr>
+    </w:p>
+    <w:p>
+      <w:pPr>
+        <w:pStyle w:val="NoSpacing"/>
+        <w:rPr>
+          <w:rFonts w:ascii="Times New Roman" w:hAnsi="Times New Roman" w:cs="Times New Roman"/>
+          <w:sz w:val="24"/>
+          <w:szCs w:val="24"/>
+        </w:rPr>
+      </w:pPr>
+    </w:p>
+    <w:p>
+      <w:pPr>
+        <w:pStyle w:val="NoSpacing"/>
+        <w:rPr>
+          <w:rFonts w:ascii="Times New Roman" w:hAnsi="Times New Roman" w:cs="Times New Roman"/>
+          <w:sz w:val="24"/>
+          <w:szCs w:val="24"/>
+        </w:rPr>
+      </w:pPr>
+    </w:p>
+    <w:p>
+      <w:pPr>
+        <w:pStyle w:val="NoSpacing"/>
+        <w:rPr>
+          <w:rFonts w:ascii="Times New Roman" w:hAnsi="Times New Roman" w:cs="Times New Roman"/>
+          <w:sz w:val="24"/>
+          <w:szCs w:val="24"/>
+        </w:rPr>
+      </w:pPr>
       <w:r>
         <w:rPr>
           <w:rFonts w:ascii="Times New Roman" w:hAnsi="Times New Roman" w:cs="Times New Roman"/>
           <w:b/>
+          <w:bCs/>
           <w:sz w:val="24"/>
           <w:szCs w:val="24"/>
           <w:u w:val="single"/>
         </w:rPr>
+        <w:lastRenderedPageBreak/>
+        <w:t>Example 2</w:t>
+      </w:r>
+      <w:proofErr w:type="gramStart"/>
+      <w:r>
+        <w:rPr>
+          <w:rFonts w:ascii="Times New Roman" w:hAnsi="Times New Roman" w:cs="Times New Roman"/>
+          <w:b/>
+          <w:bCs/>
+          <w:sz w:val="24"/>
+          <w:szCs w:val="24"/>
+          <w:u w:val="single"/>
+        </w:rPr>
         <w:t>:</w:t>
       </w:r>
       <w:r>
@@ -1551,6 +2530,842 @@
           <w:sz w:val="24"/>
           <w:szCs w:val="24"/>
         </w:rPr>
+        <w:t xml:space="preserve">  Consider</w:t>
+      </w:r>
+      <w:proofErr w:type="gramEnd"/>
+      <w:r>
+        <w:rPr>
+          <w:rFonts w:ascii="Times New Roman" w:hAnsi="Times New Roman" w:cs="Times New Roman"/>
+          <w:sz w:val="24"/>
+          <w:szCs w:val="24"/>
+        </w:rPr>
+        <w:t xml:space="preserve"> the vector function </w:t>
+      </w:r>
+      <w:r>
+        <w:rPr>
+          <w:rFonts w:ascii="Times New Roman" w:hAnsi="Times New Roman" w:cs="Times New Roman"/>
+          <w:position w:val="-28"/>
+          <w:sz w:val="24"/>
+          <w:szCs w:val="24"/>
+        </w:rPr>
+        <w:object w:dxaOrig="1719" w:dyaOrig="680" w14:anchorId="66B660A3">
+          <v:shape id="_x0000_i1046" type="#_x0000_t75" style="width:85.5pt;height:33.75pt" o:ole="">
+            <v:imagedata r:id="rId48" o:title=""/>
+          </v:shape>
+          <o:OLEObject Type="Embed" ProgID="Equation.DSMT4" ShapeID="_x0000_i1046" DrawAspect="Content" ObjectID="_1851423624" r:id="rId49"/>
+        </w:object>
+      </w:r>
+      <w:r>
+        <w:rPr>
+          <w:rFonts w:ascii="Times New Roman" w:hAnsi="Times New Roman" w:cs="Times New Roman"/>
+          <w:sz w:val="24"/>
+          <w:szCs w:val="24"/>
+        </w:rPr>
+        <w:t>.</w:t>
+      </w:r>
+    </w:p>
+    <w:p>
+      <w:pPr>
+        <w:pStyle w:val="NoSpacing"/>
+        <w:numPr>
+          <w:ilvl w:val="0"/>
+          <w:numId w:val="14"/>
+        </w:numPr>
+        <w:rPr>
+          <w:rFonts w:ascii="Times New Roman" w:hAnsi="Times New Roman" w:cs="Times New Roman"/>
+          <w:sz w:val="24"/>
+          <w:szCs w:val="24"/>
+        </w:rPr>
+      </w:pPr>
+      <w:r>
+        <w:rPr>
+          <w:rFonts w:ascii="Times New Roman" w:hAnsi="Times New Roman" w:cs="Times New Roman"/>
+          <w:sz w:val="24"/>
+          <w:szCs w:val="24"/>
+        </w:rPr>
+        <w:t xml:space="preserve">Use any approach to calculate the curvature of </w:t>
+      </w:r>
+      <w:r>
+        <w:rPr>
+          <w:rFonts w:ascii="Times New Roman" w:hAnsi="Times New Roman" w:cs="Times New Roman"/>
+          <w:position w:val="-14"/>
+          <w:sz w:val="24"/>
+          <w:szCs w:val="24"/>
+        </w:rPr>
+        <w:object w:dxaOrig="480" w:dyaOrig="400" w14:anchorId="7DA6477F">
+          <v:shape id="_x0000_i1047" type="#_x0000_t75" style="width:24pt;height:20.25pt" o:ole="">
+            <v:imagedata r:id="rId50" o:title=""/>
+          </v:shape>
+          <o:OLEObject Type="Embed" ProgID="Equation.DSMT4" ShapeID="_x0000_i1047" DrawAspect="Content" ObjectID="_1851423625" r:id="rId51"/>
+        </w:object>
+      </w:r>
+      <w:r>
+        <w:rPr>
+          <w:rFonts w:ascii="Times New Roman" w:hAnsi="Times New Roman" w:cs="Times New Roman"/>
+          <w:sz w:val="24"/>
+          <w:szCs w:val="24"/>
+        </w:rPr>
+        <w:t>.</w:t>
+      </w:r>
+    </w:p>
+    <w:p>
+      <w:pPr>
+        <w:pStyle w:val="NoSpacing"/>
+        <w:rPr>
+          <w:rFonts w:ascii="Times New Roman" w:hAnsi="Times New Roman" w:cs="Times New Roman"/>
+          <w:sz w:val="24"/>
+          <w:szCs w:val="24"/>
+        </w:rPr>
+      </w:pPr>
+    </w:p>
+    <w:p>
+      <w:pPr>
+        <w:pStyle w:val="NoSpacing"/>
+        <w:rPr>
+          <w:rFonts w:ascii="Times New Roman" w:hAnsi="Times New Roman" w:cs="Times New Roman"/>
+          <w:sz w:val="24"/>
+          <w:szCs w:val="24"/>
+        </w:rPr>
+      </w:pPr>
+    </w:p>
+    <w:p>
+      <w:pPr>
+        <w:pStyle w:val="NoSpacing"/>
+        <w:rPr>
+          <w:rFonts w:ascii="Times New Roman" w:hAnsi="Times New Roman" w:cs="Times New Roman"/>
+          <w:sz w:val="24"/>
+          <w:szCs w:val="24"/>
+        </w:rPr>
+      </w:pPr>
+    </w:p>
+    <w:p>
+      <w:pPr>
+        <w:pStyle w:val="NoSpacing"/>
+        <w:rPr>
+          <w:rFonts w:ascii="Times New Roman" w:hAnsi="Times New Roman" w:cs="Times New Roman"/>
+          <w:sz w:val="24"/>
+          <w:szCs w:val="24"/>
+        </w:rPr>
+      </w:pPr>
+    </w:p>
+    <w:p>
+      <w:pPr>
+        <w:pStyle w:val="NoSpacing"/>
+        <w:rPr>
+          <w:rFonts w:ascii="Times New Roman" w:hAnsi="Times New Roman" w:cs="Times New Roman"/>
+          <w:sz w:val="24"/>
+          <w:szCs w:val="24"/>
+        </w:rPr>
+      </w:pPr>
+    </w:p>
+    <w:p>
+      <w:pPr>
+        <w:pStyle w:val="NoSpacing"/>
+        <w:rPr>
+          <w:rFonts w:ascii="Times New Roman" w:hAnsi="Times New Roman" w:cs="Times New Roman"/>
+          <w:sz w:val="24"/>
+          <w:szCs w:val="24"/>
+        </w:rPr>
+      </w:pPr>
+    </w:p>
+    <w:p>
+      <w:pPr>
+        <w:pStyle w:val="NoSpacing"/>
+        <w:rPr>
+          <w:rFonts w:ascii="Times New Roman" w:hAnsi="Times New Roman" w:cs="Times New Roman"/>
+          <w:sz w:val="24"/>
+          <w:szCs w:val="24"/>
+        </w:rPr>
+      </w:pPr>
+    </w:p>
+    <w:p>
+      <w:pPr>
+        <w:pStyle w:val="NoSpacing"/>
+        <w:rPr>
+          <w:rFonts w:ascii="Times New Roman" w:hAnsi="Times New Roman" w:cs="Times New Roman"/>
+          <w:sz w:val="24"/>
+          <w:szCs w:val="24"/>
+        </w:rPr>
+      </w:pPr>
+    </w:p>
+    <w:p>
+      <w:pPr>
+        <w:pStyle w:val="NoSpacing"/>
+        <w:rPr>
+          <w:rFonts w:ascii="Times New Roman" w:hAnsi="Times New Roman" w:cs="Times New Roman"/>
+          <w:sz w:val="24"/>
+          <w:szCs w:val="24"/>
+        </w:rPr>
+      </w:pPr>
+    </w:p>
+    <w:p>
+      <w:pPr>
+        <w:pStyle w:val="NoSpacing"/>
+        <w:rPr>
+          <w:rFonts w:ascii="Times New Roman" w:hAnsi="Times New Roman" w:cs="Times New Roman"/>
+          <w:sz w:val="24"/>
+          <w:szCs w:val="24"/>
+        </w:rPr>
+      </w:pPr>
+    </w:p>
+    <w:p>
+      <w:pPr>
+        <w:pStyle w:val="NoSpacing"/>
+        <w:rPr>
+          <w:rFonts w:ascii="Times New Roman" w:hAnsi="Times New Roman" w:cs="Times New Roman"/>
+          <w:sz w:val="24"/>
+          <w:szCs w:val="24"/>
+        </w:rPr>
+      </w:pPr>
+    </w:p>
+    <w:p>
+      <w:pPr>
+        <w:pStyle w:val="NoSpacing"/>
+        <w:rPr>
+          <w:rFonts w:ascii="Times New Roman" w:hAnsi="Times New Roman" w:cs="Times New Roman"/>
+          <w:sz w:val="24"/>
+          <w:szCs w:val="24"/>
+        </w:rPr>
+      </w:pPr>
+    </w:p>
+    <w:p>
+      <w:pPr>
+        <w:pStyle w:val="NoSpacing"/>
+        <w:rPr>
+          <w:rFonts w:ascii="Times New Roman" w:hAnsi="Times New Roman" w:cs="Times New Roman"/>
+          <w:sz w:val="24"/>
+          <w:szCs w:val="24"/>
+        </w:rPr>
+      </w:pPr>
+    </w:p>
+    <w:p>
+      <w:pPr>
+        <w:pStyle w:val="NoSpacing"/>
+        <w:rPr>
+          <w:rFonts w:ascii="Times New Roman" w:hAnsi="Times New Roman" w:cs="Times New Roman"/>
+          <w:sz w:val="24"/>
+          <w:szCs w:val="24"/>
+        </w:rPr>
+      </w:pPr>
+    </w:p>
+    <w:p>
+      <w:pPr>
+        <w:pStyle w:val="NoSpacing"/>
+        <w:rPr>
+          <w:rFonts w:ascii="Times New Roman" w:hAnsi="Times New Roman" w:cs="Times New Roman"/>
+          <w:sz w:val="24"/>
+          <w:szCs w:val="24"/>
+        </w:rPr>
+      </w:pPr>
+    </w:p>
+    <w:p>
+      <w:pPr>
+        <w:pStyle w:val="NoSpacing"/>
+        <w:rPr>
+          <w:rFonts w:ascii="Times New Roman" w:hAnsi="Times New Roman" w:cs="Times New Roman"/>
+          <w:sz w:val="24"/>
+          <w:szCs w:val="24"/>
+        </w:rPr>
+      </w:pPr>
+    </w:p>
+    <w:p>
+      <w:pPr>
+        <w:pStyle w:val="NoSpacing"/>
+        <w:rPr>
+          <w:rFonts w:ascii="Times New Roman" w:hAnsi="Times New Roman" w:cs="Times New Roman"/>
+          <w:sz w:val="24"/>
+          <w:szCs w:val="24"/>
+        </w:rPr>
+      </w:pPr>
+    </w:p>
+    <w:p>
+      <w:pPr>
+        <w:pStyle w:val="NoSpacing"/>
+        <w:rPr>
+          <w:rFonts w:ascii="Times New Roman" w:hAnsi="Times New Roman" w:cs="Times New Roman"/>
+          <w:sz w:val="24"/>
+          <w:szCs w:val="24"/>
+        </w:rPr>
+      </w:pPr>
+    </w:p>
+    <w:p>
+      <w:pPr>
+        <w:pStyle w:val="NoSpacing"/>
+        <w:rPr>
+          <w:rFonts w:ascii="Times New Roman" w:hAnsi="Times New Roman" w:cs="Times New Roman"/>
+          <w:sz w:val="24"/>
+          <w:szCs w:val="24"/>
+        </w:rPr>
+      </w:pPr>
+    </w:p>
+    <w:p>
+      <w:pPr>
+        <w:pStyle w:val="NoSpacing"/>
+        <w:rPr>
+          <w:rFonts w:ascii="Times New Roman" w:hAnsi="Times New Roman" w:cs="Times New Roman"/>
+          <w:sz w:val="24"/>
+          <w:szCs w:val="24"/>
+        </w:rPr>
+      </w:pPr>
+    </w:p>
+    <w:p>
+      <w:pPr>
+        <w:pStyle w:val="NoSpacing"/>
+        <w:rPr>
+          <w:rFonts w:ascii="Times New Roman" w:hAnsi="Times New Roman" w:cs="Times New Roman"/>
+          <w:sz w:val="24"/>
+          <w:szCs w:val="24"/>
+        </w:rPr>
+      </w:pPr>
+    </w:p>
+    <w:p>
+      <w:pPr>
+        <w:pStyle w:val="NoSpacing"/>
+        <w:rPr>
+          <w:rFonts w:ascii="Times New Roman" w:hAnsi="Times New Roman" w:cs="Times New Roman"/>
+          <w:sz w:val="24"/>
+          <w:szCs w:val="24"/>
+        </w:rPr>
+      </w:pPr>
+    </w:p>
+    <w:p>
+      <w:pPr>
+        <w:pStyle w:val="NoSpacing"/>
+        <w:rPr>
+          <w:rFonts w:ascii="Times New Roman" w:hAnsi="Times New Roman" w:cs="Times New Roman"/>
+          <w:sz w:val="24"/>
+          <w:szCs w:val="24"/>
+        </w:rPr>
+      </w:pPr>
+    </w:p>
+    <w:p>
+      <w:pPr>
+        <w:pStyle w:val="NoSpacing"/>
+        <w:rPr>
+          <w:rFonts w:ascii="Times New Roman" w:hAnsi="Times New Roman" w:cs="Times New Roman"/>
+          <w:sz w:val="24"/>
+          <w:szCs w:val="24"/>
+        </w:rPr>
+      </w:pPr>
+    </w:p>
+    <w:p>
+      <w:pPr>
+        <w:pStyle w:val="NoSpacing"/>
+        <w:rPr>
+          <w:rFonts w:ascii="Times New Roman" w:hAnsi="Times New Roman" w:cs="Times New Roman"/>
+          <w:sz w:val="24"/>
+          <w:szCs w:val="24"/>
+        </w:rPr>
+      </w:pPr>
+    </w:p>
+    <w:p>
+      <w:pPr>
+        <w:pStyle w:val="NoSpacing"/>
+        <w:rPr>
+          <w:rFonts w:ascii="Times New Roman" w:hAnsi="Times New Roman" w:cs="Times New Roman"/>
+          <w:sz w:val="24"/>
+          <w:szCs w:val="24"/>
+        </w:rPr>
+      </w:pPr>
+    </w:p>
+    <w:p>
+      <w:pPr>
+        <w:pStyle w:val="NoSpacing"/>
+        <w:rPr>
+          <w:rFonts w:ascii="Times New Roman" w:hAnsi="Times New Roman" w:cs="Times New Roman"/>
+          <w:i/>
+          <w:iCs/>
+          <w:sz w:val="24"/>
+          <w:szCs w:val="24"/>
+        </w:rPr>
+      </w:pPr>
+      <w:r>
+        <w:rPr>
+          <w:rFonts w:ascii="Times New Roman" w:hAnsi="Times New Roman" w:cs="Times New Roman"/>
+          <w:i/>
+          <w:iCs/>
+          <w:sz w:val="24"/>
+          <w:szCs w:val="24"/>
+        </w:rPr>
+        <w:t>Note</w:t>
+      </w:r>
+      <w:proofErr w:type="gramStart"/>
+      <w:r>
+        <w:rPr>
+          <w:rFonts w:ascii="Times New Roman" w:hAnsi="Times New Roman" w:cs="Times New Roman"/>
+          <w:i/>
+          <w:iCs/>
+          <w:sz w:val="24"/>
+          <w:szCs w:val="24"/>
+        </w:rPr>
+        <w:t>:  The</w:t>
+      </w:r>
+      <w:proofErr w:type="gramEnd"/>
+      <w:r>
+        <w:rPr>
+          <w:rFonts w:ascii="Times New Roman" w:hAnsi="Times New Roman" w:cs="Times New Roman"/>
+          <w:i/>
+          <w:iCs/>
+          <w:sz w:val="24"/>
+          <w:szCs w:val="24"/>
+        </w:rPr>
+        <w:t xml:space="preserve"> curvature formula here depends on the value of </w:t>
+      </w:r>
+      <w:proofErr w:type="gramStart"/>
+      <w:r>
+        <w:rPr>
+          <w:rFonts w:ascii="Times New Roman" w:hAnsi="Times New Roman" w:cs="Times New Roman"/>
+          <w:i/>
+          <w:iCs/>
+          <w:sz w:val="24"/>
+          <w:szCs w:val="24"/>
+        </w:rPr>
+        <w:t>t !</w:t>
+      </w:r>
+      <w:proofErr w:type="gramEnd"/>
+      <w:r>
+        <w:rPr>
+          <w:rFonts w:ascii="Times New Roman" w:hAnsi="Times New Roman" w:cs="Times New Roman"/>
+          <w:i/>
+          <w:iCs/>
+          <w:sz w:val="24"/>
+          <w:szCs w:val="24"/>
+        </w:rPr>
+        <w:t xml:space="preserve">  This means that the curve </w:t>
+      </w:r>
+      <w:r>
+        <w:rPr>
+          <w:rFonts w:ascii="Times New Roman" w:hAnsi="Times New Roman" w:cs="Times New Roman"/>
+          <w:i/>
+          <w:iCs/>
+          <w:position w:val="-14"/>
+          <w:sz w:val="24"/>
+          <w:szCs w:val="24"/>
+        </w:rPr>
+        <w:object w:dxaOrig="480" w:dyaOrig="400" w14:anchorId="1B146324">
+          <v:shape id="_x0000_i1048" type="#_x0000_t75" style="width:24pt;height:20.25pt" o:ole="">
+            <v:imagedata r:id="rId52" o:title=""/>
+          </v:shape>
+          <o:OLEObject Type="Embed" ProgID="Equation.DSMT4" ShapeID="_x0000_i1048" DrawAspect="Content" ObjectID="_1851423626" r:id="rId53"/>
+        </w:object>
+      </w:r>
+      <w:r>
+        <w:rPr>
+          <w:rFonts w:ascii="Times New Roman" w:hAnsi="Times New Roman" w:cs="Times New Roman"/>
+          <w:i/>
+          <w:iCs/>
+          <w:sz w:val="24"/>
+          <w:szCs w:val="24"/>
+        </w:rPr>
+        <w:t>isn’t equally “bendy” at all points.  If we evaluate this formula at a specific value of t we can determine the curvature at that time on the curve.</w:t>
+      </w:r>
+    </w:p>
+    <w:p>
+      <w:pPr>
+        <w:pStyle w:val="NoSpacing"/>
+        <w:rPr>
+          <w:rFonts w:ascii="Times New Roman" w:hAnsi="Times New Roman" w:cs="Times New Roman"/>
+          <w:sz w:val="24"/>
+          <w:szCs w:val="24"/>
+        </w:rPr>
+      </w:pPr>
+      <w:r>
+        <w:rPr>
+          <w:rFonts w:ascii="Times New Roman" w:hAnsi="Times New Roman" w:cs="Times New Roman"/>
+          <w:noProof/>
+          <w:sz w:val="24"/>
+          <w:szCs w:val="24"/>
+        </w:rPr>
+        <w:drawing>
+          <wp:anchor distT="0" distB="0" distL="114300" distR="114300" simplePos="0" relativeHeight="251663360" behindDoc="1" locked="0" layoutInCell="1" allowOverlap="1" wp14:anchorId="1DD7E30C" wp14:editId="7E2DFE8D">
+            <wp:simplePos x="0" y="0"/>
+            <wp:positionH relativeFrom="margin">
+              <wp:align>right</wp:align>
+            </wp:positionH>
+            <wp:positionV relativeFrom="paragraph">
+              <wp:posOffset>10160</wp:posOffset>
+            </wp:positionV>
+            <wp:extent cx="1917700" cy="1760855"/>
+            <wp:effectExtent l="0" t="0" r="6350" b="0"/>
+            <wp:wrapTight wrapText="bothSides">
+              <wp:wrapPolygon edited="0">
+                <wp:start x="0" y="0"/>
+                <wp:lineTo x="0" y="21265"/>
+                <wp:lineTo x="21457" y="21265"/>
+                <wp:lineTo x="21457" y="0"/>
+                <wp:lineTo x="0" y="0"/>
+              </wp:wrapPolygon>
+            </wp:wrapTight>
+            <wp:docPr id="636026557" name="Picture 1"/>
+            <wp:cNvGraphicFramePr>
+              <a:graphicFrameLocks xmlns:a="http://schemas.openxmlformats.org/drawingml/2006/main" noChangeAspect="1"/>
+            </wp:cNvGraphicFramePr>
+            <a:graphic xmlns:a="http://schemas.openxmlformats.org/drawingml/2006/main">
+              <a:graphicData uri="http://schemas.openxmlformats.org/drawingml/2006/picture">
+                <pic:pic xmlns:pic="http://schemas.openxmlformats.org/drawingml/2006/picture">
+                  <pic:nvPicPr>
+                    <pic:cNvPr id="636026557" name=""/>
+                    <pic:cNvPicPr/>
+                  </pic:nvPicPr>
+                  <pic:blipFill>
+                    <a:blip r:embed="rId54" cstate="print">
+                      <a:extLst>
+                        <a:ext uri="{28A0092B-C50C-407E-A947-70E740481C1C}">
+                          <a14:useLocalDpi xmlns:a14="http://schemas.microsoft.com/office/drawing/2010/main" val="0"/>
+                        </a:ext>
+                      </a:extLst>
+                    </a:blip>
+                    <a:stretch>
+                      <a:fillRect/>
+                    </a:stretch>
+                  </pic:blipFill>
+                  <pic:spPr>
+                    <a:xfrm>
+                      <a:off x="0" y="0"/>
+                      <a:ext cx="1917700" cy="1760855"/>
+                    </a:xfrm>
+                    <a:prstGeom prst="rect">
+                      <a:avLst/>
+                    </a:prstGeom>
+                  </pic:spPr>
+                </pic:pic>
+              </a:graphicData>
+            </a:graphic>
+            <wp14:sizeRelH relativeFrom="page">
+              <wp14:pctWidth>0</wp14:pctWidth>
+            </wp14:sizeRelH>
+            <wp14:sizeRelV relativeFrom="page">
+              <wp14:pctHeight>0</wp14:pctHeight>
+            </wp14:sizeRelV>
+          </wp:anchor>
+        </w:drawing>
+      </w:r>
+      <w:r>
+        <w:rPr>
+          <w:rFonts w:ascii="Times New Roman" w:hAnsi="Times New Roman" w:cs="Times New Roman"/>
+          <w:sz w:val="24"/>
+          <w:szCs w:val="24"/>
+        </w:rPr>
+        <w:t xml:space="preserve">Calculate the curvature when </w:t>
+      </w:r>
+      <w:r>
+        <w:rPr>
+          <w:rFonts w:ascii="Times New Roman" w:hAnsi="Times New Roman" w:cs="Times New Roman"/>
+          <w:position w:val="-10"/>
+          <w:sz w:val="24"/>
+          <w:szCs w:val="24"/>
+        </w:rPr>
+        <w:object w:dxaOrig="1719" w:dyaOrig="320" w14:anchorId="782C2967">
+          <v:shape id="_x0000_i1049" type="#_x0000_t75" style="width:85.5pt;height:16.5pt" o:ole="">
+            <v:imagedata r:id="rId55" o:title=""/>
+          </v:shape>
+          <o:OLEObject Type="Embed" ProgID="Equation.DSMT4" ShapeID="_x0000_i1049" DrawAspect="Content" ObjectID="_1851423627" r:id="rId56"/>
+        </w:object>
+      </w:r>
+      <w:r>
+        <w:rPr>
+          <w:rFonts w:ascii="Times New Roman" w:hAnsi="Times New Roman" w:cs="Times New Roman"/>
+          <w:sz w:val="24"/>
+          <w:szCs w:val="24"/>
+        </w:rPr>
+        <w:t>.</w:t>
+      </w:r>
+    </w:p>
+    <w:p>
+      <w:pPr>
+        <w:pStyle w:val="NoSpacing"/>
+        <w:rPr>
+          <w:rFonts w:ascii="Times New Roman" w:hAnsi="Times New Roman" w:cs="Times New Roman"/>
+          <w:sz w:val="24"/>
+          <w:szCs w:val="24"/>
+        </w:rPr>
+      </w:pPr>
+    </w:p>
+    <w:p>
+      <w:pPr>
+        <w:pStyle w:val="NoSpacing"/>
+        <w:ind w:firstLine="720"/>
+        <w:rPr>
+          <w:rFonts w:ascii="Times New Roman" w:hAnsi="Times New Roman" w:cs="Times New Roman"/>
+          <w:sz w:val="24"/>
+          <w:szCs w:val="24"/>
+        </w:rPr>
+      </w:pPr>
+    </w:p>
+    <w:p>
+      <w:pPr>
+        <w:pStyle w:val="NoSpacing"/>
+        <w:ind w:firstLine="720"/>
+        <w:rPr>
+          <w:rFonts w:ascii="Times New Roman" w:hAnsi="Times New Roman" w:cs="Times New Roman"/>
+          <w:sz w:val="24"/>
+          <w:szCs w:val="24"/>
+        </w:rPr>
+      </w:pPr>
+    </w:p>
+    <w:p>
+      <w:pPr>
+        <w:pStyle w:val="NoSpacing"/>
+        <w:ind w:firstLine="720"/>
+        <w:rPr>
+          <w:rFonts w:ascii="Times New Roman" w:hAnsi="Times New Roman" w:cs="Times New Roman"/>
+          <w:sz w:val="24"/>
+          <w:szCs w:val="24"/>
+        </w:rPr>
+      </w:pPr>
+    </w:p>
+    <w:p>
+      <w:pPr>
+        <w:pStyle w:val="NoSpacing"/>
+        <w:ind w:firstLine="720"/>
+        <w:rPr>
+          <w:rFonts w:ascii="Times New Roman" w:hAnsi="Times New Roman" w:cs="Times New Roman"/>
+          <w:sz w:val="24"/>
+          <w:szCs w:val="24"/>
+        </w:rPr>
+      </w:pPr>
+    </w:p>
+    <w:p>
+      <w:pPr>
+        <w:pStyle w:val="NoSpacing"/>
+        <w:rPr>
+          <w:rFonts w:ascii="Times New Roman" w:hAnsi="Times New Roman" w:cs="Times New Roman"/>
+          <w:i/>
+          <w:iCs/>
+          <w:sz w:val="24"/>
+          <w:szCs w:val="24"/>
+        </w:rPr>
+      </w:pPr>
+    </w:p>
+    <w:p>
+      <w:pPr>
+        <w:pStyle w:val="NoSpacing"/>
+        <w:rPr>
+          <w:rFonts w:ascii="Times New Roman" w:hAnsi="Times New Roman" w:cs="Times New Roman"/>
+          <w:i/>
+          <w:iCs/>
+          <w:sz w:val="24"/>
+          <w:szCs w:val="24"/>
+        </w:rPr>
+      </w:pPr>
+    </w:p>
+    <w:p>
+      <w:pPr>
+        <w:pStyle w:val="NoSpacing"/>
+        <w:rPr>
+          <w:rFonts w:ascii="Times New Roman" w:hAnsi="Times New Roman" w:cs="Times New Roman"/>
+          <w:i/>
+          <w:iCs/>
+          <w:sz w:val="24"/>
+          <w:szCs w:val="24"/>
+        </w:rPr>
+      </w:pPr>
+    </w:p>
+    <w:p>
+      <w:pPr>
+        <w:pStyle w:val="NoSpacing"/>
+        <w:rPr>
+          <w:rFonts w:ascii="Times New Roman" w:hAnsi="Times New Roman" w:cs="Times New Roman"/>
+          <w:i/>
+          <w:iCs/>
+          <w:sz w:val="24"/>
+          <w:szCs w:val="24"/>
+        </w:rPr>
+      </w:pPr>
+    </w:p>
+    <w:p>
+      <w:pPr>
+        <w:pStyle w:val="NoSpacing"/>
+        <w:rPr>
+          <w:rFonts w:ascii="Times New Roman" w:hAnsi="Times New Roman" w:cs="Times New Roman"/>
+          <w:i/>
+          <w:iCs/>
+          <w:sz w:val="24"/>
+          <w:szCs w:val="24"/>
+        </w:rPr>
+      </w:pPr>
+    </w:p>
+    <w:p>
+      <w:pPr>
+        <w:pStyle w:val="NoSpacing"/>
+        <w:rPr>
+          <w:rFonts w:ascii="Times New Roman" w:hAnsi="Times New Roman" w:cs="Times New Roman"/>
+          <w:i/>
+          <w:iCs/>
+          <w:sz w:val="24"/>
+          <w:szCs w:val="24"/>
+        </w:rPr>
+      </w:pPr>
+    </w:p>
+    <w:p>
+      <w:pPr>
+        <w:pStyle w:val="NoSpacing"/>
+        <w:rPr>
+          <w:rFonts w:ascii="Times New Roman" w:hAnsi="Times New Roman" w:cs="Times New Roman"/>
+          <w:i/>
+          <w:iCs/>
+          <w:sz w:val="24"/>
+          <w:szCs w:val="24"/>
+        </w:rPr>
+      </w:pPr>
+    </w:p>
+    <w:p>
+      <w:pPr>
+        <w:pStyle w:val="NoSpacing"/>
+        <w:rPr>
+          <w:rFonts w:ascii="Times New Roman" w:hAnsi="Times New Roman" w:cs="Times New Roman"/>
+          <w:i/>
+          <w:iCs/>
+          <w:sz w:val="24"/>
+          <w:szCs w:val="24"/>
+        </w:rPr>
+      </w:pPr>
+    </w:p>
+    <w:p>
+      <w:pPr>
+        <w:pStyle w:val="NoSpacing"/>
+        <w:rPr>
+          <w:rFonts w:ascii="Times New Roman" w:hAnsi="Times New Roman" w:cs="Times New Roman"/>
+          <w:i/>
+          <w:iCs/>
+          <w:sz w:val="24"/>
+          <w:szCs w:val="24"/>
+        </w:rPr>
+      </w:pPr>
+    </w:p>
+    <w:p>
+      <w:pPr>
+        <w:pStyle w:val="NoSpacing"/>
+        <w:rPr>
+          <w:rFonts w:ascii="Times New Roman" w:hAnsi="Times New Roman" w:cs="Times New Roman"/>
+          <w:i/>
+          <w:iCs/>
+          <w:sz w:val="24"/>
+          <w:szCs w:val="24"/>
+        </w:rPr>
+      </w:pPr>
+    </w:p>
+    <w:p>
+      <w:pPr>
+        <w:pStyle w:val="NoSpacing"/>
+        <w:rPr>
+          <w:rFonts w:ascii="Times New Roman" w:hAnsi="Times New Roman" w:cs="Times New Roman"/>
+          <w:i/>
+          <w:iCs/>
+          <w:sz w:val="24"/>
+          <w:szCs w:val="24"/>
+        </w:rPr>
+      </w:pPr>
+      <w:r>
+        <w:rPr>
+          <w:rFonts w:ascii="Times New Roman" w:hAnsi="Times New Roman" w:cs="Times New Roman"/>
+          <w:i/>
+          <w:iCs/>
+          <w:sz w:val="24"/>
+          <w:szCs w:val="24"/>
+        </w:rPr>
+        <w:t xml:space="preserve">Note:  We can visually see the different amounts of “bend” on the curve itself and note that the curve appears the most “bent” when </w:t>
+      </w:r>
+      <w:r>
+        <w:rPr>
+          <w:rFonts w:ascii="Times New Roman" w:hAnsi="Times New Roman" w:cs="Times New Roman"/>
+          <w:i/>
+          <w:iCs/>
+          <w:position w:val="-6"/>
+          <w:sz w:val="24"/>
+          <w:szCs w:val="24"/>
+        </w:rPr>
+        <w:object w:dxaOrig="499" w:dyaOrig="279" w14:anchorId="35BF4DB8">
+          <v:shape id="_x0000_i1050" type="#_x0000_t75" style="width:24.75pt;height:13.5pt" o:ole="">
+            <v:imagedata r:id="rId57" o:title=""/>
+          </v:shape>
+          <o:OLEObject Type="Embed" ProgID="Equation.DSMT4" ShapeID="_x0000_i1050" DrawAspect="Content" ObjectID="_1851423628" r:id="rId58"/>
+        </w:object>
+      </w:r>
+      <w:r>
+        <w:rPr>
+          <w:rFonts w:ascii="Times New Roman" w:hAnsi="Times New Roman" w:cs="Times New Roman"/>
+          <w:i/>
+          <w:iCs/>
+          <w:sz w:val="24"/>
+          <w:szCs w:val="24"/>
+        </w:rPr>
+        <w:t xml:space="preserve"> (meaning we are at the point </w:t>
+      </w:r>
+      <w:r>
+        <w:rPr>
+          <w:rFonts w:ascii="Times New Roman" w:hAnsi="Times New Roman" w:cs="Times New Roman"/>
+          <w:i/>
+          <w:iCs/>
+          <w:position w:val="-14"/>
+          <w:sz w:val="24"/>
+          <w:szCs w:val="24"/>
+        </w:rPr>
+        <w:object w:dxaOrig="780" w:dyaOrig="400" w14:anchorId="07156F34">
+          <v:shape id="_x0000_i1051" type="#_x0000_t75" style="width:39pt;height:20.25pt" o:ole="">
+            <v:imagedata r:id="rId59" o:title=""/>
+          </v:shape>
+          <o:OLEObject Type="Embed" ProgID="Equation.DSMT4" ShapeID="_x0000_i1051" DrawAspect="Content" ObjectID="_1851423629" r:id="rId60"/>
+        </w:object>
+      </w:r>
+      <w:r>
+        <w:rPr>
+          <w:rFonts w:ascii="Times New Roman" w:hAnsi="Times New Roman" w:cs="Times New Roman"/>
+          <w:i/>
+          <w:iCs/>
+          <w:sz w:val="24"/>
+          <w:szCs w:val="24"/>
+        </w:rPr>
+        <w:t>).</w:t>
+      </w:r>
+    </w:p>
+    <w:p>
+      <w:pPr>
+        <w:pStyle w:val="NoSpacing"/>
+        <w:rPr>
+          <w:rFonts w:ascii="Times New Roman" w:hAnsi="Times New Roman" w:cs="Times New Roman"/>
+          <w:sz w:val="24"/>
+          <w:szCs w:val="24"/>
+        </w:rPr>
+      </w:pPr>
+      <w:r>
+        <w:rPr>
+          <w:rFonts w:ascii="Times New Roman" w:hAnsi="Times New Roman" w:cs="Times New Roman"/>
+          <w:b/>
+          <w:sz w:val="24"/>
+          <w:szCs w:val="24"/>
+          <w:u w:val="single"/>
+        </w:rPr>
+        <w:lastRenderedPageBreak/>
+        <w:t xml:space="preserve">Example </w:t>
+      </w:r>
+      <w:r>
+        <w:rPr>
+          <w:rFonts w:ascii="Times New Roman" w:hAnsi="Times New Roman" w:cs="Times New Roman"/>
+          <w:b/>
+          <w:sz w:val="24"/>
+          <w:szCs w:val="24"/>
+          <w:u w:val="single"/>
+        </w:rPr>
+        <w:t>3</w:t>
+      </w:r>
+      <w:proofErr w:type="gramStart"/>
+      <w:r>
+        <w:rPr>
+          <w:rFonts w:ascii="Times New Roman" w:hAnsi="Times New Roman" w:cs="Times New Roman"/>
+          <w:b/>
+          <w:sz w:val="24"/>
+          <w:szCs w:val="24"/>
+          <w:u w:val="single"/>
+        </w:rPr>
+        <w:t>:</w:t>
+      </w:r>
+      <w:r>
+        <w:rPr>
+          <w:rFonts w:ascii="Times New Roman" w:hAnsi="Times New Roman" w:cs="Times New Roman"/>
+          <w:sz w:val="24"/>
+          <w:szCs w:val="24"/>
+        </w:rPr>
         <w:t xml:space="preserve">  </w:t>
       </w:r>
       <w:r>
@@ -1559,7 +3374,16 @@
           <w:sz w:val="24"/>
           <w:szCs w:val="24"/>
         </w:rPr>
-        <w:t xml:space="preserve">Consider the circle given by </w:t>
+        <w:t>Consider</w:t>
+      </w:r>
+      <w:proofErr w:type="gramEnd"/>
+      <w:r>
+        <w:rPr>
+          <w:rFonts w:ascii="Times New Roman" w:hAnsi="Times New Roman" w:cs="Times New Roman"/>
+          <w:sz w:val="24"/>
+          <w:szCs w:val="24"/>
+        </w:rPr>
+        <w:t xml:space="preserve"> the circle given by </w:t>
       </w:r>
       <w:r>
         <w:rPr>
@@ -1569,10 +3393,10 @@
           <w:szCs w:val="24"/>
         </w:rPr>
         <w:object w:dxaOrig="2500" w:dyaOrig="440" w14:anchorId="38FBB20E">
-          <v:shape id="_x0000_i1038" type="#_x0000_t75" style="width:124.75pt;height:21.3pt" o:ole="">
-            <v:imagedata r:id="rId31" o:title=""/>
+          <v:shape id="_x0000_i1052" type="#_x0000_t75" style="width:125.25pt;height:21pt" o:ole="">
+            <v:imagedata r:id="rId61" o:title=""/>
           </v:shape>
-          <o:OLEObject Type="Embed" ProgID="Equation.DSMT4" ShapeID="_x0000_i1038" DrawAspect="Content" ObjectID="_1846091674" r:id="rId32"/>
+          <o:OLEObject Type="Embed" ProgID="Equation.DSMT4" ShapeID="_x0000_i1052" DrawAspect="Content" ObjectID="_1851423630" r:id="rId62"/>
         </w:object>
       </w:r>
       <w:r>
@@ -1591,10 +3415,10 @@
           <w:szCs w:val="24"/>
         </w:rPr>
         <w:object w:dxaOrig="1020" w:dyaOrig="279" w14:anchorId="34496E2E">
-          <v:shape id="_x0000_i1039" type="#_x0000_t75" style="width:50.7pt;height:15.2pt" o:ole="">
-            <v:imagedata r:id="rId33" o:title=""/>
+          <v:shape id="_x0000_i1053" type="#_x0000_t75" style="width:51pt;height:15pt" o:ole="">
+            <v:imagedata r:id="rId63" o:title=""/>
           </v:shape>
-          <o:OLEObject Type="Embed" ProgID="Equation.DSMT4" ShapeID="_x0000_i1039" DrawAspect="Content" ObjectID="_1846091675" r:id="rId34"/>
+          <o:OLEObject Type="Embed" ProgID="Equation.DSMT4" ShapeID="_x0000_i1053" DrawAspect="Content" ObjectID="_1851423631" r:id="rId64"/>
         </w:object>
       </w:r>
       <w:r>
@@ -1613,10 +3437,10 @@
           <w:szCs w:val="24"/>
         </w:rPr>
         <w:object w:dxaOrig="560" w:dyaOrig="279" w14:anchorId="57668DA3">
-          <v:shape id="_x0000_i1040" type="#_x0000_t75" style="width:28.4pt;height:15.2pt" o:ole="">
-            <v:imagedata r:id="rId35" o:title=""/>
+          <v:shape id="_x0000_i1054" type="#_x0000_t75" style="width:28.5pt;height:15pt" o:ole="">
+            <v:imagedata r:id="rId65" o:title=""/>
           </v:shape>
-          <o:OLEObject Type="Embed" ProgID="Equation.DSMT4" ShapeID="_x0000_i1040" DrawAspect="Content" ObjectID="_1846091676" r:id="rId36"/>
+          <o:OLEObject Type="Embed" ProgID="Equation.DSMT4" ShapeID="_x0000_i1054" DrawAspect="Content" ObjectID="_1851423632" r:id="rId66"/>
         </w:object>
       </w:r>
       <w:r>
@@ -1860,9 +3684,277 @@
     </w:p>
     <w:p>
       <w:pPr>
-        <w:rPr>
-          <w:rFonts w:eastAsiaTheme="minorEastAsia"/>
-          <w:szCs w:val="28"/>
+        <w:pStyle w:val="NoSpacing"/>
+        <w:rPr>
+          <w:rFonts w:ascii="Times New Roman" w:hAnsi="Times New Roman" w:cs="Times New Roman"/>
+          <w:sz w:val="24"/>
+          <w:szCs w:val="24"/>
+        </w:rPr>
+      </w:pPr>
+    </w:p>
+    <w:p>
+      <w:pPr>
+        <w:pStyle w:val="NoSpacing"/>
+        <w:rPr>
+          <w:rFonts w:ascii="Times New Roman" w:hAnsi="Times New Roman" w:cs="Times New Roman"/>
+          <w:sz w:val="24"/>
+          <w:szCs w:val="24"/>
+        </w:rPr>
+      </w:pPr>
+    </w:p>
+    <w:p>
+      <w:pPr>
+        <w:pStyle w:val="NoSpacing"/>
+        <w:rPr>
+          <w:rFonts w:ascii="Times New Roman" w:hAnsi="Times New Roman" w:cs="Times New Roman"/>
+          <w:sz w:val="24"/>
+          <w:szCs w:val="24"/>
+        </w:rPr>
+      </w:pPr>
+    </w:p>
+    <w:p>
+      <w:pPr>
+        <w:pStyle w:val="NoSpacing"/>
+        <w:rPr>
+          <w:rFonts w:ascii="Times New Roman" w:hAnsi="Times New Roman" w:cs="Times New Roman"/>
+          <w:sz w:val="24"/>
+          <w:szCs w:val="24"/>
+        </w:rPr>
+      </w:pPr>
+    </w:p>
+    <w:p>
+      <w:pPr>
+        <w:pStyle w:val="NoSpacing"/>
+        <w:rPr>
+          <w:rFonts w:ascii="Times New Roman" w:hAnsi="Times New Roman" w:cs="Times New Roman"/>
+          <w:sz w:val="24"/>
+          <w:szCs w:val="24"/>
+        </w:rPr>
+      </w:pPr>
+    </w:p>
+    <w:p>
+      <w:pPr>
+        <w:pStyle w:val="NoSpacing"/>
+        <w:rPr>
+          <w:rFonts w:ascii="Times New Roman" w:hAnsi="Times New Roman" w:cs="Times New Roman"/>
+          <w:sz w:val="24"/>
+          <w:szCs w:val="24"/>
+        </w:rPr>
+      </w:pPr>
+    </w:p>
+    <w:p>
+      <w:pPr>
+        <w:pStyle w:val="NoSpacing"/>
+        <w:rPr>
+          <w:rFonts w:ascii="Times New Roman" w:hAnsi="Times New Roman" w:cs="Times New Roman"/>
+          <w:sz w:val="24"/>
+          <w:szCs w:val="24"/>
+        </w:rPr>
+      </w:pPr>
+    </w:p>
+    <w:p>
+      <w:pPr>
+        <w:pStyle w:val="NoSpacing"/>
+        <w:rPr>
+          <w:rFonts w:ascii="Times New Roman" w:hAnsi="Times New Roman" w:cs="Times New Roman"/>
+          <w:sz w:val="24"/>
+          <w:szCs w:val="24"/>
+        </w:rPr>
+      </w:pPr>
+    </w:p>
+    <w:p>
+      <w:pPr>
+        <w:pStyle w:val="NoSpacing"/>
+        <w:rPr>
+          <w:rFonts w:ascii="Times New Roman" w:hAnsi="Times New Roman" w:cs="Times New Roman"/>
+          <w:sz w:val="24"/>
+          <w:szCs w:val="24"/>
+        </w:rPr>
+      </w:pPr>
+    </w:p>
+    <w:p>
+      <w:pPr>
+        <w:pStyle w:val="NoSpacing"/>
+        <w:rPr>
+          <w:rFonts w:ascii="Times New Roman" w:hAnsi="Times New Roman" w:cs="Times New Roman"/>
+          <w:sz w:val="24"/>
+          <w:szCs w:val="24"/>
+        </w:rPr>
+      </w:pPr>
+    </w:p>
+    <w:p>
+      <w:pPr>
+        <w:pStyle w:val="NoSpacing"/>
+        <w:rPr>
+          <w:rFonts w:ascii="Times New Roman" w:hAnsi="Times New Roman" w:cs="Times New Roman"/>
+          <w:sz w:val="24"/>
+          <w:szCs w:val="24"/>
+        </w:rPr>
+      </w:pPr>
+    </w:p>
+    <w:p>
+      <w:pPr>
+        <w:pStyle w:val="NoSpacing"/>
+        <w:rPr>
+          <w:rFonts w:ascii="Times New Roman" w:hAnsi="Times New Roman" w:cs="Times New Roman"/>
+          <w:sz w:val="24"/>
+          <w:szCs w:val="24"/>
+        </w:rPr>
+      </w:pPr>
+    </w:p>
+    <w:p>
+      <w:pPr>
+        <w:pStyle w:val="NoSpacing"/>
+        <w:rPr>
+          <w:rFonts w:ascii="Times New Roman" w:hAnsi="Times New Roman" w:cs="Times New Roman"/>
+          <w:sz w:val="24"/>
+          <w:szCs w:val="24"/>
+        </w:rPr>
+      </w:pPr>
+    </w:p>
+    <w:p>
+      <w:pPr>
+        <w:pStyle w:val="NoSpacing"/>
+        <w:rPr>
+          <w:rFonts w:ascii="Times New Roman" w:hAnsi="Times New Roman" w:cs="Times New Roman"/>
+          <w:sz w:val="24"/>
+          <w:szCs w:val="24"/>
+        </w:rPr>
+      </w:pPr>
+    </w:p>
+    <w:p>
+      <w:pPr>
+        <w:pStyle w:val="NoSpacing"/>
+        <w:rPr>
+          <w:rFonts w:ascii="Times New Roman" w:hAnsi="Times New Roman" w:cs="Times New Roman"/>
+          <w:sz w:val="24"/>
+          <w:szCs w:val="24"/>
+        </w:rPr>
+      </w:pPr>
+    </w:p>
+    <w:p>
+      <w:pPr>
+        <w:pStyle w:val="NoSpacing"/>
+        <w:rPr>
+          <w:rFonts w:ascii="Times New Roman" w:hAnsi="Times New Roman" w:cs="Times New Roman"/>
+          <w:sz w:val="24"/>
+          <w:szCs w:val="24"/>
+        </w:rPr>
+      </w:pPr>
+    </w:p>
+    <w:p>
+      <w:pPr>
+        <w:pStyle w:val="NoSpacing"/>
+        <w:rPr>
+          <w:rFonts w:ascii="Times New Roman" w:hAnsi="Times New Roman" w:cs="Times New Roman"/>
+          <w:sz w:val="24"/>
+          <w:szCs w:val="24"/>
+        </w:rPr>
+      </w:pPr>
+    </w:p>
+    <w:p>
+      <w:pPr>
+        <w:pStyle w:val="NoSpacing"/>
+        <w:rPr>
+          <w:rFonts w:ascii="Times New Roman" w:hAnsi="Times New Roman" w:cs="Times New Roman"/>
+          <w:i/>
+          <w:sz w:val="24"/>
+          <w:szCs w:val="24"/>
+        </w:rPr>
+      </w:pPr>
+      <w:r>
+        <w:rPr>
+          <w:rFonts w:ascii="Times New Roman" w:hAnsi="Times New Roman" w:cs="Times New Roman"/>
+          <w:i/>
+          <w:sz w:val="24"/>
+          <w:szCs w:val="24"/>
+        </w:rPr>
+        <w:t>Note</w:t>
+      </w:r>
+      <w:proofErr w:type="gramStart"/>
+      <w:r>
+        <w:rPr>
+          <w:rFonts w:ascii="Times New Roman" w:hAnsi="Times New Roman" w:cs="Times New Roman"/>
+          <w:i/>
+          <w:sz w:val="24"/>
+          <w:szCs w:val="24"/>
+        </w:rPr>
+        <w:t>:  Intuitively</w:t>
+      </w:r>
+      <w:proofErr w:type="gramEnd"/>
+      <w:r>
+        <w:rPr>
+          <w:rFonts w:ascii="Times New Roman" w:hAnsi="Times New Roman" w:cs="Times New Roman"/>
+          <w:i/>
+          <w:sz w:val="24"/>
+          <w:szCs w:val="24"/>
+        </w:rPr>
+        <w:t xml:space="preserve"> this means that if a circle has a small radius, its curvature is high.  This makes sense because over a fixed amount of arc length small circles turn more abruptly than large circles. </w:t>
+      </w:r>
+    </w:p>
+    <w:p>
+      <w:pPr>
+        <w:pStyle w:val="NoSpacing"/>
+        <w:rPr>
+          <w:rFonts w:ascii="Times New Roman" w:hAnsi="Times New Roman" w:cs="Times New Roman"/>
+          <w:i/>
+          <w:sz w:val="24"/>
+          <w:szCs w:val="24"/>
+        </w:rPr>
+      </w:pPr>
+    </w:p>
+    <w:p>
+      <w:pPr>
+        <w:pStyle w:val="NoSpacing"/>
+        <w:rPr>
+          <w:rFonts w:ascii="Times New Roman" w:hAnsi="Times New Roman" w:cs="Times New Roman"/>
+          <w:i/>
+          <w:sz w:val="24"/>
+          <w:szCs w:val="24"/>
+        </w:rPr>
+      </w:pPr>
+      <w:r>
+        <w:rPr>
+          <w:rFonts w:ascii="Times New Roman" w:hAnsi="Times New Roman" w:cs="Times New Roman"/>
+          <w:i/>
+          <w:sz w:val="24"/>
+          <w:szCs w:val="24"/>
+        </w:rPr>
+        <w:t xml:space="preserve">Note:  This example gives us a way to visualize the amount of “bend” that a given curvature looks like. For example, if we calculate, as in Example 1, that we have </w:t>
+      </w:r>
+      <w:r>
+        <w:rPr>
+          <w:rFonts w:ascii="Times New Roman" w:hAnsi="Times New Roman" w:cs="Times New Roman"/>
+          <w:i/>
+          <w:position w:val="-24"/>
+          <w:sz w:val="24"/>
+          <w:szCs w:val="24"/>
+        </w:rPr>
+        <w:object w:dxaOrig="620" w:dyaOrig="620" w14:anchorId="175D36EE">
+          <v:shape id="_x0000_i1055" type="#_x0000_t75" style="width:30.75pt;height:30.75pt" o:ole="">
+            <v:imagedata r:id="rId67" o:title=""/>
+          </v:shape>
+          <o:OLEObject Type="Embed" ProgID="Equation.DSMT4" ShapeID="_x0000_i1055" DrawAspect="Content" ObjectID="_1851423633" r:id="rId68"/>
+        </w:object>
+      </w:r>
+      <w:r>
+        <w:rPr>
+          <w:rFonts w:ascii="Times New Roman" w:hAnsi="Times New Roman" w:cs="Times New Roman"/>
+          <w:i/>
+          <w:sz w:val="24"/>
+          <w:szCs w:val="24"/>
+        </w:rPr>
+        <w:t>then we know that this is the same amount of “bend” that we would see in a circle of radius 2.</w:t>
+      </w:r>
+    </w:p>
+    <w:p>
+      <w:pPr>
+        <w:pStyle w:val="NoSpacing"/>
+        <w:rPr>
+          <w:rFonts w:ascii="Times New Roman" w:hAnsi="Times New Roman" w:cs="Times New Roman"/>
+          <w:iCs/>
+          <w:sz w:val="24"/>
+          <w:szCs w:val="24"/>
         </w:rPr>
       </w:pPr>
     </w:p>
@@ -1880,14 +3972,42 @@
           <w:szCs w:val="28"/>
           <w:u w:val="single"/>
         </w:rPr>
-        <w:t>Example 2:</w:t>
+        <w:lastRenderedPageBreak/>
+        <w:t xml:space="preserve">Example </w:t>
+      </w:r>
+      <w:r>
+        <w:rPr>
+          <w:rFonts w:eastAsiaTheme="minorEastAsia"/>
+          <w:b/>
+          <w:szCs w:val="28"/>
+          <w:u w:val="single"/>
+        </w:rPr>
+        <w:t>4</w:t>
+      </w:r>
+      <w:proofErr w:type="gramStart"/>
+      <w:r>
+        <w:rPr>
+          <w:rFonts w:eastAsiaTheme="minorEastAsia"/>
+          <w:b/>
+          <w:szCs w:val="28"/>
+          <w:u w:val="single"/>
+        </w:rPr>
+        <w:t>:</w:t>
       </w:r>
       <w:r>
         <w:rPr>
           <w:rFonts w:eastAsiaTheme="minorEastAsia"/>
           <w:szCs w:val="28"/>
         </w:rPr>
-        <w:t xml:space="preserve">  Let </w:t>
+        <w:t xml:space="preserve">  Let</w:t>
+      </w:r>
+      <w:proofErr w:type="gramEnd"/>
+      <w:r>
+        <w:rPr>
+          <w:rFonts w:eastAsiaTheme="minorEastAsia"/>
+          <w:szCs w:val="28"/>
+        </w:rPr>
+        <w:t xml:space="preserve"> </w:t>
       </w:r>
       <w:r>
         <w:rPr>
@@ -1911,10 +4031,10 @@
           <w:szCs w:val="28"/>
         </w:rPr>
         <w:object w:dxaOrig="1420" w:dyaOrig="360" w14:anchorId="714D5FAA">
-          <v:shape id="_x0000_i1041" type="#_x0000_t75" style="width:71pt;height:19.25pt" o:ole="">
-            <v:imagedata r:id="rId37" o:title=""/>
+          <v:shape id="_x0000_i1056" type="#_x0000_t75" style="width:70.5pt;height:18.75pt" o:ole="">
+            <v:imagedata r:id="rId69" o:title=""/>
           </v:shape>
-          <o:OLEObject Type="Embed" ProgID="Equation.DSMT4" ShapeID="_x0000_i1041" DrawAspect="Content" ObjectID="_1846091677" r:id="rId38"/>
+          <o:OLEObject Type="Embed" ProgID="Equation.DSMT4" ShapeID="_x0000_i1056" DrawAspect="Content" ObjectID="_1851423634" r:id="rId70"/>
         </w:object>
       </w:r>
       <w:r>
@@ -2197,8 +4317,97 @@
         </w:rPr>
       </w:pPr>
     </w:p>
+    <w:p>
+      <w:pPr>
+        <w:rPr>
+          <w:rFonts w:eastAsiaTheme="minorEastAsia"/>
+          <w:szCs w:val="28"/>
+        </w:rPr>
+      </w:pPr>
+    </w:p>
+    <w:p>
+      <w:pPr>
+        <w:rPr>
+          <w:rFonts w:eastAsiaTheme="minorEastAsia"/>
+          <w:szCs w:val="28"/>
+        </w:rPr>
+      </w:pPr>
+    </w:p>
+    <w:p>
+      <w:pPr>
+        <w:rPr>
+          <w:rFonts w:eastAsiaTheme="minorEastAsia"/>
+          <w:szCs w:val="28"/>
+        </w:rPr>
+      </w:pPr>
+    </w:p>
+    <w:p>
+      <w:pPr>
+        <w:rPr>
+          <w:rFonts w:eastAsiaTheme="minorEastAsia"/>
+          <w:szCs w:val="28"/>
+        </w:rPr>
+      </w:pPr>
+    </w:p>
+    <w:p>
+      <w:pPr>
+        <w:rPr>
+          <w:rFonts w:eastAsiaTheme="minorEastAsia"/>
+          <w:szCs w:val="28"/>
+        </w:rPr>
+      </w:pPr>
+    </w:p>
+    <w:p>
+      <w:pPr>
+        <w:rPr>
+          <w:rFonts w:eastAsiaTheme="minorEastAsia"/>
+          <w:szCs w:val="28"/>
+        </w:rPr>
+      </w:pPr>
+    </w:p>
+    <w:p>
+      <w:pPr>
+        <w:pStyle w:val="NoSpacing"/>
+        <w:rPr>
+          <w:rFonts w:eastAsiaTheme="minorEastAsia"/>
+          <w:szCs w:val="28"/>
+        </w:rPr>
+      </w:pPr>
+      <w:r>
+        <w:rPr>
+          <w:rFonts w:ascii="Times New Roman" w:hAnsi="Times New Roman" w:cs="Times New Roman"/>
+          <w:i/>
+          <w:iCs/>
+          <w:sz w:val="24"/>
+          <w:szCs w:val="24"/>
+        </w:rPr>
+        <w:t>Note</w:t>
+      </w:r>
+      <w:proofErr w:type="gramStart"/>
+      <w:r>
+        <w:rPr>
+          <w:rFonts w:ascii="Times New Roman" w:hAnsi="Times New Roman" w:cs="Times New Roman"/>
+          <w:i/>
+          <w:iCs/>
+          <w:sz w:val="24"/>
+          <w:szCs w:val="24"/>
+        </w:rPr>
+        <w:t>:  It</w:t>
+      </w:r>
+      <w:proofErr w:type="gramEnd"/>
+      <w:r>
+        <w:rPr>
+          <w:rFonts w:ascii="Times New Roman" w:hAnsi="Times New Roman" w:cs="Times New Roman"/>
+          <w:i/>
+          <w:iCs/>
+          <w:sz w:val="24"/>
+          <w:szCs w:val="24"/>
+        </w:rPr>
+        <w:t xml:space="preserve"> is important to note here that calculating the general curvature formula would be quite messy and so it is advantageous to only calculate the curvature at the specific values of t desired here.  </w:t>
+      </w:r>
+    </w:p>
     <w:sectPr>
-      <w:headerReference w:type="first" r:id="rId39"/>
+      <w:headerReference w:type="first" r:id="rId71"/>
       <w:pgSz w:w="12240" w:h="15840"/>
       <w:pgMar w:top="720" w:right="720" w:bottom="720" w:left="720" w:header="720" w:footer="720" w:gutter="0"/>
       <w:cols w:space="720"/>
@@ -2315,6 +4524,7 @@
             </w:rPr>
             <w:t>Chapter 2</w:t>
           </w:r>
+          <w:proofErr w:type="gramStart"/>
           <w:r>
             <w:rPr>
               <w:rFonts w:cs="Times New Roman"/>
@@ -2329,7 +4539,16 @@
               <w:b/>
               <w:sz w:val="32"/>
             </w:rPr>
-            <w:t>Vector-Valued Functions</w:t>
+            <w:t>Vector</w:t>
+          </w:r>
+          <w:proofErr w:type="gramEnd"/>
+          <w:r>
+            <w:rPr>
+              <w:rFonts w:cs="Times New Roman"/>
+              <w:b/>
+              <w:sz w:val="32"/>
+            </w:rPr>
+            <w:t>-Valued Functions</w:t>
           </w:r>
         </w:p>
       </w:tc>
@@ -3503,6 +5722,95 @@
     </w:lvl>
   </w:abstractNum>
   <w:abstractNum w:abstractNumId="12" w15:restartNumberingAfterBreak="0">
+    <w:nsid w:val="76347769"/>
+    <w:multiLevelType w:val="hybridMultilevel"/>
+    <w:tmpl w:val="A95A7E88"/>
+    <w:lvl w:ilvl="0" w:tplc="04090017">
+      <w:start w:val="1"/>
+      <w:numFmt w:val="lowerLetter"/>
+      <w:lvlText w:val="%1)"/>
+      <w:lvlJc w:val="left"/>
+      <w:pPr>
+        <w:ind w:left="360" w:hanging="360"/>
+      </w:pPr>
+      <w:rPr>
+        <w:rFonts w:hint="default"/>
+      </w:rPr>
+    </w:lvl>
+    <w:lvl w:ilvl="1" w:tplc="04090019" w:tentative="1">
+      <w:start w:val="1"/>
+      <w:numFmt w:val="lowerLetter"/>
+      <w:lvlText w:val="%2."/>
+      <w:lvlJc w:val="left"/>
+      <w:pPr>
+        <w:ind w:left="1080" w:hanging="360"/>
+      </w:pPr>
+    </w:lvl>
+    <w:lvl w:ilvl="2" w:tplc="0409001B" w:tentative="1">
+      <w:start w:val="1"/>
+      <w:numFmt w:val="lowerRoman"/>
+      <w:lvlText w:val="%3."/>
+      <w:lvlJc w:val="right"/>
+      <w:pPr>
+        <w:ind w:left="1800" w:hanging="180"/>
+      </w:pPr>
+    </w:lvl>
+    <w:lvl w:ilvl="3" w:tplc="0409000F" w:tentative="1">
+      <w:start w:val="1"/>
+      <w:numFmt w:val="decimal"/>
+      <w:lvlText w:val="%4."/>
+      <w:lvlJc w:val="left"/>
+      <w:pPr>
+        <w:ind w:left="2520" w:hanging="360"/>
+      </w:pPr>
+    </w:lvl>
+    <w:lvl w:ilvl="4" w:tplc="04090019" w:tentative="1">
+      <w:start w:val="1"/>
+      <w:numFmt w:val="lowerLetter"/>
+      <w:lvlText w:val="%5."/>
+      <w:lvlJc w:val="left"/>
+      <w:pPr>
+        <w:ind w:left="3240" w:hanging="360"/>
+      </w:pPr>
+    </w:lvl>
+    <w:lvl w:ilvl="5" w:tplc="0409001B" w:tentative="1">
+      <w:start w:val="1"/>
+      <w:numFmt w:val="lowerRoman"/>
+      <w:lvlText w:val="%6."/>
+      <w:lvlJc w:val="right"/>
+      <w:pPr>
+        <w:ind w:left="3960" w:hanging="180"/>
+      </w:pPr>
+    </w:lvl>
+    <w:lvl w:ilvl="6" w:tplc="0409000F" w:tentative="1">
+      <w:start w:val="1"/>
+      <w:numFmt w:val="decimal"/>
+      <w:lvlText w:val="%7."/>
+      <w:lvlJc w:val="left"/>
+      <w:pPr>
+        <w:ind w:left="4680" w:hanging="360"/>
+      </w:pPr>
+    </w:lvl>
+    <w:lvl w:ilvl="7" w:tplc="04090019" w:tentative="1">
+      <w:start w:val="1"/>
+      <w:numFmt w:val="lowerLetter"/>
+      <w:lvlText w:val="%8."/>
+      <w:lvlJc w:val="left"/>
+      <w:pPr>
+        <w:ind w:left="5400" w:hanging="360"/>
+      </w:pPr>
+    </w:lvl>
+    <w:lvl w:ilvl="8" w:tplc="0409001B" w:tentative="1">
+      <w:start w:val="1"/>
+      <w:numFmt w:val="lowerRoman"/>
+      <w:lvlText w:val="%9."/>
+      <w:lvlJc w:val="right"/>
+      <w:pPr>
+        <w:ind w:left="6120" w:hanging="180"/>
+      </w:pPr>
+    </w:lvl>
+  </w:abstractNum>
+  <w:abstractNum w:abstractNumId="13" w15:restartNumberingAfterBreak="0">
     <w:nsid w:val="7D6D0457"/>
     <w:multiLevelType w:val="hybridMultilevel"/>
     <w:tmpl w:val="731C7C70"/>
@@ -3631,7 +5939,7 @@
     <w:abstractNumId w:val="6"/>
   </w:num>
   <w:num w:numId="6" w16cid:durableId="597100957">
-    <w:abstractNumId w:val="12"/>
+    <w:abstractNumId w:val="13"/>
   </w:num>
   <w:num w:numId="7" w16cid:durableId="1718316319">
     <w:abstractNumId w:val="9"/>
@@ -3653,6 +5961,9 @@
   </w:num>
   <w:num w:numId="13" w16cid:durableId="481434568">
     <w:abstractNumId w:val="1"/>
+  </w:num>
+  <w:num w:numId="14" w16cid:durableId="1971933144">
+    <w:abstractNumId w:val="12"/>
   </w:num>
   <w:numIdMacAtCleanup w:val="10"/>
 </w:numbering>

</xml_diff>